<commit_message>
Funcionalidades del Sistema Informe de Tesis
</commit_message>
<xml_diff>
--- a/DOC/Tesis Dariel Enmanuel Cabrera Lopez.docx
+++ b/DOC/Tesis Dariel Enmanuel Cabrera Lopez.docx
@@ -12158,15 +12158,7 @@
           </w:tcPr>
           <w:p>
             <w:r>
-              <w:t>Riesgo en Desarrollo</w:t>
-            </w:r>
-            <w:proofErr w:type="gramStart"/>
-            <w:r>
-              <w:t>:  (</w:t>
-            </w:r>
-            <w:proofErr w:type="gramEnd"/>
-            <w:r>
-              <w:t>Alta/Media/ Baja)</w:t>
+              <w:t>Riesgo en Desarrollo:(Alta/Media/ Baja)</w:t>
             </w:r>
           </w:p>
           <w:p>
@@ -12664,10 +12656,10 @@
                   <v:path o:extrusionok="f" gradientshapeok="t" o:connecttype="rect"/>
                   <o:lock v:ext="edit" aspectratio="t"/>
                 </v:shapetype>
-                <v:shape id="_x0000_i1025" type="#_x0000_t75" style="width:283.5pt;height:256.5pt" o:ole="">
+                <v:shape id="_x0000_i1025" type="#_x0000_t75" style="width:283.6pt;height:256.7pt" o:ole="">
                   <v:imagedata r:id="rId34" o:title=""/>
                 </v:shape>
-                <o:OLEObject Type="Embed" ProgID="PBrush" ShapeID="_x0000_i1025" DrawAspect="Content" ObjectID="_1804340965" r:id="rId35"/>
+                <o:OLEObject Type="Embed" ProgID="PBrush" ShapeID="_x0000_i1025" DrawAspect="Content" ObjectID="_1804538513" r:id="rId35"/>
               </w:object>
             </w:r>
           </w:p>
@@ -16334,29 +16326,7 @@
             <w:sz w:val="28"/>
             <w:szCs w:val="28"/>
           </w:rPr>
-          <m:t>=</m:t>
-        </m:r>
-        <m:r>
-          <m:rPr>
-            <m:sty m:val="p"/>
-          </m:rPr>
-          <w:rPr>
-            <w:rFonts w:ascii="Cambria Math" w:hAnsi="Cambria Math"/>
-            <w:sz w:val="28"/>
-            <w:szCs w:val="28"/>
-          </w:rPr>
-          <m:t xml:space="preserve"> </m:t>
-        </m:r>
-        <m:r>
-          <m:rPr>
-            <m:sty m:val="p"/>
-          </m:rPr>
-          <w:rPr>
-            <w:rFonts w:ascii="Cambria Math" w:hAnsi="Cambria Math"/>
-            <w:sz w:val="28"/>
-            <w:szCs w:val="28"/>
-          </w:rPr>
-          <m:t>115</m:t>
+          <m:t>= 115</m:t>
         </m:r>
       </m:oMath>
       <w:r>
@@ -16465,18 +16435,7 @@
             <w:sz w:val="28"/>
             <w:szCs w:val="28"/>
           </w:rPr>
-          <m:t>=</m:t>
-        </m:r>
-        <m:r>
-          <m:rPr>
-            <m:sty m:val="p"/>
-          </m:rPr>
-          <w:rPr>
-            <w:rFonts w:ascii="Cambria Math" w:hAnsi="Cambria Math"/>
-            <w:sz w:val="28"/>
-            <w:szCs w:val="28"/>
-          </w:rPr>
-          <m:t>121</m:t>
+          <m:t>=121</m:t>
         </m:r>
       </m:oMath>
     </w:p>

</xml_diff>

<commit_message>
Historias Tecnicas Informe de Tesis
</commit_message>
<xml_diff>
--- a/DOC/Tesis Dariel Enmanuel Cabrera Lopez.docx
+++ b/DOC/Tesis Dariel Enmanuel Cabrera Lopez.docx
@@ -7149,21 +7149,7 @@
         <w:rPr>
           <w:rFonts w:ascii="Arial" w:hAnsi="Arial" w:cs="Arial"/>
         </w:rPr>
-        <w:t xml:space="preserve">Cuenta con servicio </w:t>
-      </w:r>
-      <w:proofErr w:type="gramStart"/>
-      <w:r>
-        <w:rPr>
-          <w:rFonts w:ascii="Arial" w:hAnsi="Arial" w:cs="Arial"/>
-        </w:rPr>
-        <w:t>web</w:t>
-      </w:r>
-      <w:proofErr w:type="gramEnd"/>
-      <w:r>
-        <w:rPr>
-          <w:rFonts w:ascii="Arial" w:hAnsi="Arial" w:cs="Arial"/>
-        </w:rPr>
-        <w:t xml:space="preserve"> pero no ofrece todas las funcionalidades que su versión de escritorio.</w:t>
+        <w:t>Cuenta con servicio web pero no ofrece todas las funcionalidades que su versión de escritorio.</w:t>
       </w:r>
     </w:p>
     <w:p>
@@ -7464,16 +7450,8 @@
         <w:rPr>
           <w:rFonts w:ascii="Arial" w:hAnsi="Arial" w:cs="Arial"/>
         </w:rPr>
-        <w:t xml:space="preserve"> </w:t>
-      </w:r>
-      <w:proofErr w:type="gramStart"/>
-      <w:r>
-        <w:rPr>
-          <w:rFonts w:ascii="Arial" w:hAnsi="Arial" w:cs="Arial"/>
-        </w:rPr>
-        <w:t>y  Linux</w:t>
-      </w:r>
-      <w:proofErr w:type="gramEnd"/>
+        <w:t xml:space="preserve"> y  Linux</w:t>
+      </w:r>
     </w:p>
     <w:p>
       <w:pPr>
@@ -8762,18 +8740,10 @@
         <w:t>Se escogió este EDI ya que es el más usado para desarrollar aplicaciones en cualquier lenguaje, es bastante completo, además de las extensiones que tien</w:t>
       </w:r>
       <w:r>
-        <w:t xml:space="preserve">en que la ayudan mucho a la </w:t>
-      </w:r>
-      <w:proofErr w:type="gramStart"/>
-      <w:r>
-        <w:t xml:space="preserve">hora </w:t>
-      </w:r>
-      <w:r>
-        <w:t xml:space="preserve"> de</w:t>
-      </w:r>
-      <w:proofErr w:type="gramEnd"/>
-      <w:r>
-        <w:t xml:space="preserve"> codificar</w:t>
+        <w:t xml:space="preserve">en que la ayudan mucho a la hora </w:t>
+      </w:r>
+      <w:r>
+        <w:t xml:space="preserve"> de codificar</w:t>
       </w:r>
       <w:r>
         <w:t>.</w:t>
@@ -9171,13 +9141,8 @@
         <w:lastRenderedPageBreak/>
         <w:t xml:space="preserve">programas de red altamente escalables, </w:t>
       </w:r>
-      <w:proofErr w:type="gramStart"/>
-      <w:r>
-        <w:t>como</w:t>
-      </w:r>
-      <w:proofErr w:type="gramEnd"/>
-      <w:r>
-        <w:t xml:space="preserve"> </w:t>
+      <w:r>
+        <w:t xml:space="preserve">como </w:t>
       </w:r>
       <w:r>
         <w:t xml:space="preserve">por ejemplo, servidores web. Fue creado por Ryan Dahl en 2009 y su evolución está apadrinada por la empresa </w:t>
@@ -9954,15 +9919,7 @@
         <w:t>Codificación</w:t>
       </w:r>
       <w:r>
-        <w:t>: Después de que las historias han sido desarrolladas y de que se ha hecho el trabajo de diseño preliminar, el equipo no inicia la codificación, sino que desarrolla una serie de pruebas unitarias a cada una de las historias que se van a incluir en la entrega en curso (incremento de software</w:t>
-      </w:r>
-      <w:proofErr w:type="gramStart"/>
-      <w:r>
-        <w:t>).Una</w:t>
-      </w:r>
-      <w:proofErr w:type="gramEnd"/>
-      <w:r>
-        <w:t xml:space="preserve"> vez creada la prueba unitaria, el desarrollador está mejor capacitado para centrarse en lo que debe implementarse para pasar la prueba. No se agrega nada extraño (MS). Una vez que el código está terminado, se le aplica de inmediato una prueba unitaria, con lo que se obtiene retroalimentación instantánea para los desarrolladores</w:t>
+        <w:t>: Después de que las historias han sido desarrolladas y de que se ha hecho el trabajo de diseño preliminar, el equipo no inicia la codificación, sino que desarrolla una serie de pruebas unitarias a cada una de las historias que se van a incluir en la entrega en curso (incremento de software).Una vez creada la prueba unitaria, el desarrollador está mejor capacitado para centrarse en lo que debe implementarse para pasar la prueba. No se agrega nada extraño (MS). Una vez que el código está terminado, se le aplica de inmediato una prueba unitaria, con lo que se obtiene retroalimentación instantánea para los desarrolladores</w:t>
       </w:r>
       <w:r>
         <w:t>.</w:t>
@@ -10426,7 +10383,6 @@
           <w:b/>
           <w:sz w:val="24"/>
           <w:szCs w:val="24"/>
-          <w:u w:val="single"/>
         </w:rPr>
       </w:pPr>
       <w:r>
@@ -10448,42 +10404,175 @@
           <w:b/>
           <w:sz w:val="24"/>
           <w:szCs w:val="24"/>
-          <w:u w:val="single"/>
         </w:rPr>
         <w:t>Funcionalidades del Sistema</w:t>
       </w:r>
       <w:bookmarkEnd w:id="60"/>
     </w:p>
     <w:p>
-      <w:pPr>
+      <w:r>
+        <w:t>Las funcionalidades del sistema se refieren al conjunto de funciones que satisfagan las necesidades implícitas o explícitas de los usuarios, al ser utilizado bajo condiciones específicas. Se relaciona directamente con aquello que el software hace para satisfacer necesidades, mientras que las demás características se refieren al cómo y al cuándo. Evalúa el cumplimiento de requerimientos, la exactitud de los resultados, la seguridad del producto y la interacción con otros sistemas.</w:t>
+      </w:r>
+      <w:r>
+        <w:fldChar w:fldCharType="begin"/>
+      </w:r>
+      <w:r>
+        <w:instrText xml:space="preserve"> ADDIN ZOTERO_ITEM CSL_CITATION {"citationID":"VicJ1Tzb","properties":{"formattedCitation":"(\\uc0\\u171{}Funcionalidad\\uc0\\u187{}, 2015)","plainCitation":"(«Funcionalidad», 2015)","noteIndex":0},"citationItems":[{"id":"5LOWnStX/wSSvk5db","uris":["http://zotero.org/users/13351438/items/9YYEEMSI"],"itemData":{"id":61,"type":"post-weblog","abstract":"Se refiere a la capacidad del producto de software para suministrar un conjunto de funciones que satisfagan las necesidades implícitas o explícitas de los usuarios, al ser utilizado bajo condicione…","container-title":"gestion de la calidad del software - norma iso-9126","language":"es","title":"Funcionalidad","URL":"https://diplomadogestioncalidadsoftware2015.wordpress.com/norma-iso-9126/calidad-interna-y-externa/funcionalidad/","accessed":{"date-parts":[["2024",1,8]]},"issued":{"date-parts":[["2015",6,7]]}}}],"schema":"https://github.com/citation-style-language/schema/raw/master/csl-citation.json"} </w:instrText>
+      </w:r>
+      <w:r>
+        <w:fldChar w:fldCharType="separate"/>
+      </w:r>
+      <w:r>
+        <w:t>(«Funcionalidad», 2015)</w:t>
+      </w:r>
+      <w:r>
+        <w:fldChar w:fldCharType="end"/>
+      </w:r>
+      <w:r>
         <w:rPr>
           <w:color w:val="303030"/>
         </w:rPr>
-      </w:pPr>
-      <w:r>
-        <w:t>Las funcionalidades del sistema se refieren al conjunto de funciones que satisfagan las necesidades implícitas o explícitas de los usuarios, al ser utilizado bajo condiciones específicas. Se relaciona directamente con aquello que el software hace para satisfacer necesidades, mientras que las demás características se refieren al cómo y al cuándo. Evalúa el cumplimiento de requerimientos, la exactitud de los resultados, la seguridad del producto y la interacción con otros sistemas.</w:t>
-      </w:r>
-      <w:r>
-        <w:fldChar w:fldCharType="begin"/>
-      </w:r>
-      <w:r>
-        <w:instrText xml:space="preserve"> ADDIN ZOTERO_ITEM CSL_CITATION {"citationID":"VicJ1Tzb","properties":{"formattedCitation":"(\\uc0\\u171{}Funcionalidad\\uc0\\u187{}, 2015)","plainCitation":"(«Funcionalidad», 2015)","noteIndex":0},"citationItems":[{"id":"5LOWnStX/wSSvk5db","uris":["http://zotero.org/users/13351438/items/9YYEEMSI"],"itemData":{"id":61,"type":"post-weblog","abstract":"Se refiere a la capacidad del producto de software para suministrar un conjunto de funciones que satisfagan las necesidades implícitas o explícitas de los usuarios, al ser utilizado bajo condicione…","container-title":"gestion de la calidad del software - norma iso-9126","language":"es","title":"Funcionalidad","URL":"https://diplomadogestioncalidadsoftware2015.wordpress.com/norma-iso-9126/calidad-interna-y-externa/funcionalidad/","accessed":{"date-parts":[["2024",1,8]]},"issued":{"date-parts":[["2015",6,7]]}}}],"schema":"https://github.com/citation-style-language/schema/raw/master/csl-citation.json"} </w:instrText>
-      </w:r>
-      <w:r>
-        <w:fldChar w:fldCharType="separate"/>
-      </w:r>
-      <w:r>
-        <w:t>(«Funcionalidad», 2015)</w:t>
-      </w:r>
-      <w:r>
-        <w:fldChar w:fldCharType="end"/>
-      </w:r>
-      <w:r>
-        <w:rPr>
-          <w:color w:val="303030"/>
-        </w:rPr>
         <w:t xml:space="preserve"> </w:t>
       </w:r>
+      <w:r>
+        <w:t>, estos requerimientos se van a describir por medio de Historias de Usuarios(HU)</w:t>
+      </w:r>
+      <w:r>
+        <w:t>.</w:t>
+      </w:r>
+    </w:p>
+    <w:p>
+      <w:pPr>
+        <w:pStyle w:val="Prrafodelista"/>
+        <w:numPr>
+          <w:ilvl w:val="0"/>
+          <w:numId w:val="45"/>
+        </w:numPr>
+      </w:pPr>
+      <w:r>
+        <w:t xml:space="preserve">HU_1: </w:t>
+      </w:r>
+      <w:proofErr w:type="spellStart"/>
+      <w:r>
+        <w:t>Login</w:t>
+      </w:r>
+      <w:proofErr w:type="spellEnd"/>
+      <w:r>
+        <w:t>.</w:t>
+      </w:r>
+    </w:p>
+    <w:p>
+      <w:pPr>
+        <w:pStyle w:val="Prrafodelista"/>
+        <w:numPr>
+          <w:ilvl w:val="0"/>
+          <w:numId w:val="45"/>
+        </w:numPr>
+      </w:pPr>
+      <w:r>
+        <w:t>HU_2: Inicio.</w:t>
+      </w:r>
+    </w:p>
+    <w:p>
+      <w:pPr>
+        <w:pStyle w:val="Prrafodelista"/>
+        <w:numPr>
+          <w:ilvl w:val="0"/>
+          <w:numId w:val="45"/>
+        </w:numPr>
+      </w:pPr>
+      <w:r>
+        <w:t>HU_3: Gestionar Cálculos.</w:t>
+      </w:r>
+    </w:p>
+    <w:p>
+      <w:pPr>
+        <w:pStyle w:val="Prrafodelista"/>
+        <w:numPr>
+          <w:ilvl w:val="0"/>
+          <w:numId w:val="45"/>
+        </w:numPr>
+      </w:pPr>
+      <w:r>
+        <w:t>HU_4: Nuevo Calculo.</w:t>
+      </w:r>
+    </w:p>
+    <w:p>
+      <w:pPr>
+        <w:pStyle w:val="Prrafodelista"/>
+        <w:numPr>
+          <w:ilvl w:val="0"/>
+          <w:numId w:val="45"/>
+        </w:numPr>
+      </w:pPr>
+      <w:r>
+        <w:t>HU_5: Gestionar Usuarios.</w:t>
+      </w:r>
+    </w:p>
+    <w:p>
+      <w:pPr>
+        <w:pStyle w:val="Prrafodelista"/>
+        <w:numPr>
+          <w:ilvl w:val="0"/>
+          <w:numId w:val="45"/>
+        </w:numPr>
+      </w:pPr>
+      <w:r>
+        <w:t>HU_6: Nuevo Usuario.</w:t>
+      </w:r>
+    </w:p>
+    <w:p>
+      <w:pPr>
+        <w:pStyle w:val="Prrafodelista"/>
+        <w:numPr>
+          <w:ilvl w:val="0"/>
+          <w:numId w:val="45"/>
+        </w:numPr>
+      </w:pPr>
+      <w:r>
+        <w:t>HU_7: Gestionar Trazas.</w:t>
+      </w:r>
+    </w:p>
+    <w:p>
+      <w:pPr>
+        <w:pStyle w:val="Prrafodelista"/>
+        <w:numPr>
+          <w:ilvl w:val="0"/>
+          <w:numId w:val="45"/>
+        </w:numPr>
+      </w:pPr>
+      <w:r>
+        <w:t>HU_8: Búsqueda Avanzada.</w:t>
+      </w:r>
+    </w:p>
+    <w:p>
+      <w:pPr>
+        <w:pStyle w:val="Prrafodelista"/>
+        <w:numPr>
+          <w:ilvl w:val="0"/>
+          <w:numId w:val="45"/>
+        </w:numPr>
+      </w:pPr>
+      <w:r>
+        <w:t>HU_9: Gestionar Ubicaciones.</w:t>
+      </w:r>
+    </w:p>
+    <w:p>
+      <w:pPr>
+        <w:pStyle w:val="Prrafodelista"/>
+        <w:numPr>
+          <w:ilvl w:val="0"/>
+          <w:numId w:val="45"/>
+        </w:numPr>
+      </w:pPr>
+      <w:r>
+        <w:t>HU_10: Ver reportes en gráficas.</w:t>
+      </w:r>
+    </w:p>
+    <w:p>
+      <w:pPr>
+        <w:pStyle w:val="Prrafodelista"/>
+      </w:pPr>
     </w:p>
     <w:p>
       <w:pPr>
@@ -10628,687 +10717,15 @@
           <w:ilvl w:val="2"/>
           <w:numId w:val="31"/>
         </w:numPr>
-        <w:rPr>
-          <w:rStyle w:val="Ttulo1Car"/>
-          <w:rFonts w:ascii="Arial" w:hAnsi="Arial" w:cs="Arial"/>
-          <w:b/>
-          <w:bCs w:val="0"/>
-          <w:sz w:val="24"/>
-          <w:szCs w:val="24"/>
-        </w:rPr>
-      </w:pPr>
-      <w:bookmarkStart w:id="74" w:name="_Toc193705051"/>
-      <w:r>
-        <w:rPr>
-          <w:rStyle w:val="Ttulo1Car"/>
-          <w:rFonts w:ascii="Arial" w:hAnsi="Arial" w:cs="Arial"/>
-          <w:b/>
-          <w:bCs w:val="0"/>
-          <w:sz w:val="24"/>
-          <w:szCs w:val="24"/>
-        </w:rPr>
-        <w:t>Requisitos Funcionales:</w:t>
+      </w:pPr>
+      <w:bookmarkStart w:id="74" w:name="_Toc193705052"/>
+      <w:r>
+        <w:t>Historias Técnicas</w:t>
+      </w:r>
+      <w:r>
+        <w:t>:</w:t>
       </w:r>
       <w:bookmarkEnd w:id="74"/>
-    </w:p>
-    <w:p>
-      <w:r>
-        <w:t xml:space="preserve">Requisitos Funcionales (Capacidades): Describe las funciones que lleva a cabo el software; como debe reaccionar </w:t>
-      </w:r>
-      <w:r>
-        <w:t>este</w:t>
-      </w:r>
-      <w:r>
-        <w:t xml:space="preserve"> ante ciertas entradas y como debe comportarse en situaciones particulares.</w:t>
-      </w:r>
-    </w:p>
-    <w:p>
-      <w:r>
-        <w:rPr>
-          <w:b/>
-        </w:rPr>
-        <w:t>F1: Autenticarse:</w:t>
-      </w:r>
-      <w:r>
-        <w:t xml:space="preserve"> Permitirá al usuario acceder a la Página Web</w:t>
-      </w:r>
-    </w:p>
-    <w:p>
-      <w:r>
-        <w:t>Entrada: Usuario y Contr</w:t>
-      </w:r>
-      <w:r>
-        <w:t>a</w:t>
-      </w:r>
-      <w:r>
-        <w:t>seña</w:t>
-      </w:r>
-    </w:p>
-    <w:p>
-      <w:r>
-        <w:t>Salida: El usuario accede a la Página Web</w:t>
-      </w:r>
-    </w:p>
-    <w:p>
-      <w:r>
-        <w:t>F2: Gestión de Usuarios</w:t>
-      </w:r>
-    </w:p>
-    <w:p>
-      <w:pPr>
-        <w:pStyle w:val="Prrafodelista"/>
-        <w:numPr>
-          <w:ilvl w:val="0"/>
-          <w:numId w:val="9"/>
-        </w:numPr>
-        <w:rPr>
-          <w:lang w:eastAsia="es-ES"/>
-        </w:rPr>
-      </w:pPr>
-      <w:bookmarkStart w:id="75" w:name="_Hlk185234264"/>
-      <w:r>
-        <w:rPr>
-          <w:lang w:eastAsia="es-ES"/>
-        </w:rPr>
-        <w:t xml:space="preserve">El Sistema </w:t>
-      </w:r>
-      <w:commentRangeStart w:id="76"/>
-      <w:commentRangeStart w:id="77"/>
-      <w:r>
-        <w:rPr>
-          <w:lang w:eastAsia="es-ES"/>
-        </w:rPr>
-        <w:t xml:space="preserve"> </w:t>
-      </w:r>
-      <w:commentRangeEnd w:id="76"/>
-      <w:r>
-        <w:rPr>
-          <w:rStyle w:val="Refdecomentario"/>
-        </w:rPr>
-        <w:commentReference w:id="76"/>
-      </w:r>
-      <w:bookmarkEnd w:id="75"/>
-      <w:commentRangeEnd w:id="77"/>
-      <w:r>
-        <w:rPr>
-          <w:rStyle w:val="Refdecomentario"/>
-        </w:rPr>
-        <w:commentReference w:id="77"/>
-      </w:r>
-      <w:r>
-        <w:rPr>
-          <w:lang w:eastAsia="es-ES"/>
-        </w:rPr>
-        <w:t>debe permitir a los usuarios registrarse y crear una cuenta.</w:t>
-      </w:r>
-    </w:p>
-    <w:p>
-      <w:pPr>
-        <w:pStyle w:val="Prrafodelista"/>
-        <w:numPr>
-          <w:ilvl w:val="0"/>
-          <w:numId w:val="9"/>
-        </w:numPr>
-        <w:rPr>
-          <w:lang w:eastAsia="es-ES"/>
-        </w:rPr>
-      </w:pPr>
-      <w:r>
-        <w:rPr>
-          <w:lang w:eastAsia="es-ES"/>
-        </w:rPr>
-        <w:t xml:space="preserve">El Sistema </w:t>
-      </w:r>
-      <w:r>
-        <w:rPr>
-          <w:lang w:eastAsia="es-ES"/>
-        </w:rPr>
-        <w:t>debe permitir a los usuarios iniciar sesión y acceder a su cuenta.</w:t>
-      </w:r>
-    </w:p>
-    <w:p>
-      <w:pPr>
-        <w:pStyle w:val="Prrafodelista"/>
-        <w:numPr>
-          <w:ilvl w:val="0"/>
-          <w:numId w:val="9"/>
-        </w:numPr>
-        <w:rPr>
-          <w:lang w:eastAsia="es-ES"/>
-        </w:rPr>
-      </w:pPr>
-      <w:r>
-        <w:rPr>
-          <w:lang w:eastAsia="es-ES"/>
-        </w:rPr>
-        <w:t xml:space="preserve">El </w:t>
-      </w:r>
-      <w:r>
-        <w:rPr>
-          <w:lang w:eastAsia="es-ES"/>
-        </w:rPr>
-        <w:t xml:space="preserve">Sistema </w:t>
-      </w:r>
-      <w:r>
-        <w:rPr>
-          <w:lang w:eastAsia="es-ES"/>
-        </w:rPr>
-        <w:t>debe</w:t>
-      </w:r>
-      <w:r>
-        <w:rPr>
-          <w:lang w:eastAsia="es-ES"/>
-        </w:rPr>
-        <w:t xml:space="preserve"> permitir a los usuarios editar su perfil.</w:t>
-      </w:r>
-    </w:p>
-    <w:p>
-      <w:pPr>
-        <w:pStyle w:val="Prrafodelista"/>
-        <w:numPr>
-          <w:ilvl w:val="0"/>
-          <w:numId w:val="9"/>
-        </w:numPr>
-        <w:rPr>
-          <w:lang w:eastAsia="es-ES"/>
-        </w:rPr>
-      </w:pPr>
-      <w:r>
-        <w:rPr>
-          <w:lang w:eastAsia="es-ES"/>
-        </w:rPr>
-        <w:t xml:space="preserve">El Sistema </w:t>
-      </w:r>
-      <w:commentRangeStart w:id="78"/>
-      <w:commentRangeStart w:id="79"/>
-      <w:r>
-        <w:rPr>
-          <w:lang w:eastAsia="es-ES"/>
-        </w:rPr>
-        <w:t xml:space="preserve"> </w:t>
-      </w:r>
-      <w:commentRangeEnd w:id="78"/>
-      <w:r>
-        <w:rPr>
-          <w:rStyle w:val="Refdecomentario"/>
-        </w:rPr>
-        <w:commentReference w:id="78"/>
-      </w:r>
-      <w:commentRangeEnd w:id="79"/>
-      <w:r>
-        <w:rPr>
-          <w:rStyle w:val="Refdecomentario"/>
-        </w:rPr>
-        <w:commentReference w:id="79"/>
-      </w:r>
-      <w:r>
-        <w:rPr>
-          <w:lang w:eastAsia="es-ES"/>
-        </w:rPr>
-        <w:t>debe permitir a los usuarios cambiar su contraseña.</w:t>
-      </w:r>
-    </w:p>
-    <w:p>
-      <w:pPr>
-        <w:pStyle w:val="Prrafodelista"/>
-        <w:numPr>
-          <w:ilvl w:val="0"/>
-          <w:numId w:val="9"/>
-        </w:numPr>
-        <w:rPr>
-          <w:lang w:eastAsia="es-ES"/>
-        </w:rPr>
-      </w:pPr>
-      <w:r>
-        <w:rPr>
-          <w:lang w:eastAsia="es-ES"/>
-        </w:rPr>
-        <w:t xml:space="preserve">El Sistema </w:t>
-      </w:r>
-      <w:r>
-        <w:rPr>
-          <w:lang w:eastAsia="es-ES"/>
-        </w:rPr>
-        <w:t>debe permitir a los usuarios eliminar su cuenta.</w:t>
-      </w:r>
-    </w:p>
-    <w:p>
-      <w:pPr>
-        <w:rPr>
-          <w:lang w:eastAsia="es-ES"/>
-        </w:rPr>
-      </w:pPr>
-      <w:r>
-        <w:rPr>
-          <w:lang w:eastAsia="es-ES"/>
-        </w:rPr>
-        <w:lastRenderedPageBreak/>
-        <w:t>F3: Gestión de Datos</w:t>
-      </w:r>
-    </w:p>
-    <w:p>
-      <w:pPr>
-        <w:pStyle w:val="Prrafodelista"/>
-        <w:numPr>
-          <w:ilvl w:val="0"/>
-          <w:numId w:val="10"/>
-        </w:numPr>
-        <w:rPr>
-          <w:lang w:eastAsia="es-ES"/>
-        </w:rPr>
-      </w:pPr>
-      <w:r>
-        <w:rPr>
-          <w:lang w:eastAsia="es-ES"/>
-        </w:rPr>
-        <w:t xml:space="preserve">El Sistema </w:t>
-      </w:r>
-      <w:r>
-        <w:rPr>
-          <w:lang w:eastAsia="es-ES"/>
-        </w:rPr>
-        <w:t xml:space="preserve"> </w:t>
-      </w:r>
-      <w:r>
-        <w:rPr>
-          <w:lang w:eastAsia="es-ES"/>
-        </w:rPr>
-        <w:t xml:space="preserve"> debe almacenar los datos de las ecuaciones calculadas por los usuarios.</w:t>
-      </w:r>
-    </w:p>
-    <w:p>
-      <w:pPr>
-        <w:pStyle w:val="Prrafodelista"/>
-        <w:numPr>
-          <w:ilvl w:val="0"/>
-          <w:numId w:val="10"/>
-        </w:numPr>
-        <w:rPr>
-          <w:lang w:eastAsia="es-ES"/>
-        </w:rPr>
-      </w:pPr>
-      <w:r>
-        <w:rPr>
-          <w:lang w:eastAsia="es-ES"/>
-        </w:rPr>
-        <w:t>El Sistema</w:t>
-      </w:r>
-      <w:r>
-        <w:rPr>
-          <w:lang w:eastAsia="es-ES"/>
-        </w:rPr>
-        <w:t xml:space="preserve"> </w:t>
-      </w:r>
-      <w:r>
-        <w:rPr>
-          <w:lang w:eastAsia="es-ES"/>
-        </w:rPr>
-        <w:t>debe almacenar los datos de las variables utilizadas en las ecuaciones.</w:t>
-      </w:r>
-    </w:p>
-    <w:p>
-      <w:pPr>
-        <w:pStyle w:val="Prrafodelista"/>
-        <w:numPr>
-          <w:ilvl w:val="0"/>
-          <w:numId w:val="10"/>
-        </w:numPr>
-        <w:rPr>
-          <w:lang w:eastAsia="es-ES"/>
-        </w:rPr>
-      </w:pPr>
-      <w:r>
-        <w:rPr>
-          <w:lang w:eastAsia="es-ES"/>
-        </w:rPr>
-        <w:t xml:space="preserve">El Sistema </w:t>
-      </w:r>
-      <w:commentRangeStart w:id="80"/>
-      <w:commentRangeStart w:id="81"/>
-      <w:r>
-        <w:rPr>
-          <w:lang w:eastAsia="es-ES"/>
-        </w:rPr>
-        <w:t xml:space="preserve"> </w:t>
-      </w:r>
-      <w:commentRangeEnd w:id="80"/>
-      <w:r>
-        <w:rPr>
-          <w:rStyle w:val="Refdecomentario"/>
-        </w:rPr>
-        <w:commentReference w:id="80"/>
-      </w:r>
-      <w:commentRangeEnd w:id="81"/>
-      <w:r>
-        <w:rPr>
-          <w:rStyle w:val="Refdecomentario"/>
-        </w:rPr>
-        <w:commentReference w:id="81"/>
-      </w:r>
-      <w:r>
-        <w:rPr>
-          <w:lang w:eastAsia="es-ES"/>
-        </w:rPr>
-        <w:t>debe almacenar los datos de los resultados de las ecuaciones.</w:t>
-      </w:r>
-    </w:p>
-    <w:p>
-      <w:pPr>
-        <w:pStyle w:val="Prrafodelista"/>
-        <w:numPr>
-          <w:ilvl w:val="0"/>
-          <w:numId w:val="10"/>
-        </w:numPr>
-        <w:rPr>
-          <w:lang w:eastAsia="es-ES"/>
-        </w:rPr>
-      </w:pPr>
-      <w:r>
-        <w:rPr>
-          <w:lang w:eastAsia="es-ES"/>
-        </w:rPr>
-        <w:t xml:space="preserve">El </w:t>
-      </w:r>
-      <w:r>
-        <w:rPr>
-          <w:lang w:eastAsia="es-ES"/>
-        </w:rPr>
-        <w:t xml:space="preserve">Sistema </w:t>
-      </w:r>
-      <w:r>
-        <w:rPr>
-          <w:lang w:eastAsia="es-ES"/>
-        </w:rPr>
-        <w:t>debe</w:t>
-      </w:r>
-      <w:r>
-        <w:rPr>
-          <w:lang w:eastAsia="es-ES"/>
-        </w:rPr>
-        <w:t xml:space="preserve"> permitir a los usuarios recuperar los datos almacenados.</w:t>
-      </w:r>
-    </w:p>
-    <w:p>
-      <w:pPr>
-        <w:pStyle w:val="Prrafodelista"/>
-        <w:numPr>
-          <w:ilvl w:val="0"/>
-          <w:numId w:val="10"/>
-        </w:numPr>
-        <w:rPr>
-          <w:lang w:eastAsia="es-ES"/>
-        </w:rPr>
-      </w:pPr>
-      <w:r>
-        <w:rPr>
-          <w:lang w:eastAsia="es-ES"/>
-        </w:rPr>
-        <w:t xml:space="preserve">El </w:t>
-      </w:r>
-      <w:r>
-        <w:rPr>
-          <w:lang w:eastAsia="es-ES"/>
-        </w:rPr>
-        <w:t xml:space="preserve">Sistema </w:t>
-      </w:r>
-      <w:r>
-        <w:rPr>
-          <w:lang w:eastAsia="es-ES"/>
-        </w:rPr>
-        <w:t>debe</w:t>
-      </w:r>
-      <w:r>
-        <w:rPr>
-          <w:lang w:eastAsia="es-ES"/>
-        </w:rPr>
-        <w:t xml:space="preserve"> permitir a los usuarios eliminar los datos almacenados.</w:t>
-      </w:r>
-    </w:p>
-    <w:p>
-      <w:pPr>
-        <w:rPr>
-          <w:lang w:eastAsia="es-ES"/>
-        </w:rPr>
-      </w:pPr>
-      <w:r>
-        <w:rPr>
-          <w:lang w:eastAsia="es-ES"/>
-        </w:rPr>
-        <w:t>F4: Visualización de Datos:</w:t>
-      </w:r>
-    </w:p>
-    <w:p>
-      <w:pPr>
-        <w:pStyle w:val="Prrafodelista"/>
-        <w:numPr>
-          <w:ilvl w:val="0"/>
-          <w:numId w:val="11"/>
-        </w:numPr>
-        <w:rPr>
-          <w:lang w:eastAsia="es-ES"/>
-        </w:rPr>
-      </w:pPr>
-      <w:r>
-        <w:rPr>
-          <w:lang w:eastAsia="es-ES"/>
-        </w:rPr>
-        <w:t xml:space="preserve">El Sistema </w:t>
-      </w:r>
-      <w:r>
-        <w:rPr>
-          <w:lang w:eastAsia="es-ES"/>
-        </w:rPr>
-        <w:t>debe mostrar una lista de las ecuaciones calculadas por el usuario.</w:t>
-      </w:r>
-    </w:p>
-    <w:p>
-      <w:pPr>
-        <w:pStyle w:val="Prrafodelista"/>
-        <w:numPr>
-          <w:ilvl w:val="0"/>
-          <w:numId w:val="11"/>
-        </w:numPr>
-        <w:rPr>
-          <w:lang w:eastAsia="es-ES"/>
-        </w:rPr>
-      </w:pPr>
-      <w:r>
-        <w:rPr>
-          <w:lang w:eastAsia="es-ES"/>
-        </w:rPr>
-        <w:t xml:space="preserve">El Sistema </w:t>
-      </w:r>
-      <w:r>
-        <w:rPr>
-          <w:rStyle w:val="Refdecomentario"/>
-          <w:sz w:val="24"/>
-          <w:szCs w:val="24"/>
-        </w:rPr>
-        <w:t>d</w:t>
-      </w:r>
-      <w:r>
-        <w:rPr>
-          <w:lang w:eastAsia="es-ES"/>
-        </w:rPr>
-        <w:t>ebe</w:t>
-      </w:r>
-      <w:r>
-        <w:rPr>
-          <w:lang w:eastAsia="es-ES"/>
-        </w:rPr>
-        <w:t xml:space="preserve"> mostrar los detalles de cada ecuación, incluyendo la ecuación en sí, las variables utilizadas y el resultado.</w:t>
-      </w:r>
-    </w:p>
-    <w:p>
-      <w:pPr>
-        <w:pStyle w:val="Prrafodelista"/>
-        <w:numPr>
-          <w:ilvl w:val="0"/>
-          <w:numId w:val="11"/>
-        </w:numPr>
-        <w:rPr>
-          <w:lang w:eastAsia="es-ES"/>
-        </w:rPr>
-      </w:pPr>
-      <w:r>
-        <w:rPr>
-          <w:lang w:eastAsia="es-ES"/>
-        </w:rPr>
-        <w:t xml:space="preserve">El Sistema </w:t>
-      </w:r>
-      <w:r>
-        <w:rPr>
-          <w:lang w:eastAsia="es-ES"/>
-        </w:rPr>
-        <w:t>debe permitir a los usuarios filtrar y ordenar las ecuaciones.</w:t>
-      </w:r>
-    </w:p>
-    <w:p>
-      <w:pPr>
-        <w:pStyle w:val="Prrafodelista"/>
-        <w:numPr>
-          <w:ilvl w:val="0"/>
-          <w:numId w:val="11"/>
-        </w:numPr>
-        <w:rPr>
-          <w:lang w:eastAsia="es-ES"/>
-        </w:rPr>
-      </w:pPr>
-      <w:r>
-        <w:rPr>
-          <w:lang w:eastAsia="es-ES"/>
-        </w:rPr>
-        <w:t xml:space="preserve">El Sistema </w:t>
-      </w:r>
-      <w:r>
-        <w:rPr>
-          <w:lang w:eastAsia="es-ES"/>
-        </w:rPr>
-        <w:t>debe permitir a los usuarios exportar los datos de las ecuaciones a un archivo.</w:t>
-      </w:r>
-    </w:p>
-    <w:p>
-      <w:pPr>
-        <w:rPr>
-          <w:lang w:eastAsia="es-ES"/>
-        </w:rPr>
-      </w:pPr>
-      <w:r>
-        <w:rPr>
-          <w:lang w:eastAsia="es-ES"/>
-        </w:rPr>
-        <w:tab/>
-      </w:r>
-      <w:r>
-        <w:rPr>
-          <w:b/>
-          <w:lang w:eastAsia="es-ES"/>
-        </w:rPr>
-        <w:t xml:space="preserve">F5: Búsqueda: </w:t>
-      </w:r>
-      <w:r>
-        <w:rPr>
-          <w:lang w:eastAsia="es-ES"/>
-        </w:rPr>
-        <w:t>Si la página web debe incluir un motor de búsqueda que permita a los usuarios encontrar rápidamente lo que buscan.</w:t>
-      </w:r>
-    </w:p>
-    <w:p>
-      <w:pPr>
-        <w:rPr>
-          <w:lang w:eastAsia="es-ES"/>
-        </w:rPr>
-      </w:pPr>
-      <w:r>
-        <w:rPr>
-          <w:lang w:eastAsia="es-ES"/>
-        </w:rPr>
-        <w:t xml:space="preserve">F6: Ayuda y Soporte: </w:t>
-      </w:r>
-    </w:p>
-    <w:p>
-      <w:pPr>
-        <w:pStyle w:val="Prrafodelista"/>
-        <w:numPr>
-          <w:ilvl w:val="0"/>
-          <w:numId w:val="12"/>
-        </w:numPr>
-        <w:rPr>
-          <w:lang w:eastAsia="es-ES"/>
-        </w:rPr>
-      </w:pPr>
-      <w:r>
-        <w:rPr>
-          <w:lang w:eastAsia="es-ES"/>
-        </w:rPr>
-        <w:t xml:space="preserve">El </w:t>
-      </w:r>
-      <w:r>
-        <w:rPr>
-          <w:lang w:eastAsia="es-ES"/>
-        </w:rPr>
-        <w:t xml:space="preserve">Sistema </w:t>
-      </w:r>
-      <w:r>
-        <w:rPr>
-          <w:lang w:eastAsia="es-ES"/>
-        </w:rPr>
-        <w:t>debe</w:t>
-      </w:r>
-      <w:r>
-        <w:rPr>
-          <w:lang w:eastAsia="es-ES"/>
-        </w:rPr>
-        <w:t xml:space="preserve"> tener una sección de ayuda que proporcione información sobre cómo usar la página web.</w:t>
-      </w:r>
-    </w:p>
-    <w:p>
-      <w:pPr>
-        <w:pStyle w:val="Prrafodelista"/>
-        <w:numPr>
-          <w:ilvl w:val="0"/>
-          <w:numId w:val="12"/>
-        </w:numPr>
-        <w:rPr>
-          <w:lang w:eastAsia="es-ES"/>
-        </w:rPr>
-      </w:pPr>
-      <w:r>
-        <w:rPr>
-          <w:lang w:eastAsia="es-ES"/>
-        </w:rPr>
-        <w:t xml:space="preserve">El Sistema </w:t>
-      </w:r>
-      <w:r>
-        <w:rPr>
-          <w:lang w:eastAsia="es-ES"/>
-        </w:rPr>
-        <w:t xml:space="preserve"> </w:t>
-      </w:r>
-      <w:r>
-        <w:rPr>
-          <w:lang w:eastAsia="es-ES"/>
-        </w:rPr>
-        <w:t xml:space="preserve"> debe tener un sistema de contacto que permita a los usuarios ponerse en contacto con el equipo de soporte técnico.</w:t>
-      </w:r>
-    </w:p>
-    <w:p/>
-    <w:p>
-      <w:pPr>
-        <w:pStyle w:val="Ttulo3"/>
-        <w:numPr>
-          <w:ilvl w:val="2"/>
-          <w:numId w:val="31"/>
-        </w:numPr>
-      </w:pPr>
-      <w:bookmarkStart w:id="82" w:name="_Toc193705052"/>
-      <w:r>
-        <w:t>Historias Técnicas</w:t>
-      </w:r>
-      <w:r>
-        <w:t>:</w:t>
-      </w:r>
-      <w:bookmarkEnd w:id="82"/>
     </w:p>
     <w:p>
       <w:r>
@@ -11328,71 +10745,45 @@
       </w:pPr>
       <w:r>
         <w:rPr>
+          <w:b/>
+          <w:bCs/>
           <w:sz w:val="24"/>
         </w:rPr>
+        <w:lastRenderedPageBreak/>
         <w:t>Rendimiento</w:t>
       </w:r>
-    </w:p>
-    <w:p>
-      <w:pPr>
-        <w:numPr>
-          <w:ilvl w:val="0"/>
-          <w:numId w:val="13"/>
-        </w:numPr>
-        <w:spacing w:before="100" w:beforeAutospacing="1" w:after="100" w:afterAutospacing="1" w:line="240" w:lineRule="auto"/>
-      </w:pPr>
-      <w:r>
-        <w:t>Tiempos de respuesta y carga</w:t>
-      </w:r>
-    </w:p>
-    <w:p>
-      <w:pPr>
-        <w:numPr>
-          <w:ilvl w:val="0"/>
-          <w:numId w:val="13"/>
-        </w:numPr>
-        <w:spacing w:before="100" w:beforeAutospacing="1" w:after="100" w:afterAutospacing="1" w:line="240" w:lineRule="auto"/>
-      </w:pPr>
-      <w:r>
-        <w:t>Capacidad de manejo bajo diferentes cargas de trabajo</w:t>
-      </w:r>
-    </w:p>
-    <w:p>
-      <w:pPr>
-        <w:numPr>
-          <w:ilvl w:val="0"/>
-          <w:numId w:val="13"/>
-        </w:numPr>
-        <w:spacing w:before="100" w:beforeAutospacing="1" w:after="100" w:afterAutospacing="1" w:line="240" w:lineRule="auto"/>
-      </w:pPr>
-      <w:r>
-        <w:t>Escalabilidad (vertical y horizontal)</w:t>
-      </w:r>
-    </w:p>
-    <w:p>
-      <w:pPr>
-        <w:numPr>
-          <w:ilvl w:val="0"/>
-          <w:numId w:val="13"/>
-        </w:numPr>
-        <w:spacing w:before="100" w:beforeAutospacing="1" w:after="100" w:afterAutospacing="1" w:line="240" w:lineRule="auto"/>
-      </w:pPr>
-      <w:r>
-        <w:t>Eficiencia de consultas y operaciones</w:t>
+      <w:r>
+        <w:rPr>
+          <w:b/>
+          <w:bCs/>
+          <w:sz w:val="24"/>
+        </w:rPr>
+        <w:t>:</w:t>
+      </w:r>
+      <w:r>
+        <w:rPr>
+          <w:sz w:val="24"/>
+        </w:rPr>
+        <w:t xml:space="preserve"> El sistema debe tener tiempos de respuesta y carga rápidas al usuario y evitar demoras innecesarias, así como eficiencia de las consultas y operaciones. Los tiempos de respuesta y velocidad de procesamiento, no serán mayores entre 2 y 3 segundos para las recuperaciones. </w:t>
       </w:r>
     </w:p>
     <w:p>
       <w:pPr>
         <w:pStyle w:val="Textoindependiente1"/>
         <w:rPr>
+          <w:b/>
+          <w:bCs/>
           <w:sz w:val="24"/>
-        </w:rPr>
-      </w:pPr>
-      <w:r>
-        <w:rPr>
+          <w:lang w:val="es-ES_tradnl"/>
+        </w:rPr>
+      </w:pPr>
+      <w:r>
+        <w:rPr>
+          <w:b/>
+          <w:bCs/>
           <w:sz w:val="24"/>
         </w:rPr>
-        <w:t xml:space="preserve"> Seguridad</w:t>
+        <w:t>Seguridad</w:t>
       </w:r>
     </w:p>
     <w:p>
@@ -11404,7 +10795,6 @@
         <w:spacing w:before="100" w:beforeAutospacing="1" w:after="100" w:afterAutospacing="1" w:line="240" w:lineRule="auto"/>
       </w:pPr>
       <w:r>
-        <w:lastRenderedPageBreak/>
         <w:t>Autenticación y autorización</w:t>
       </w:r>
     </w:p>
@@ -11417,7 +10807,10 @@
         <w:spacing w:before="100" w:beforeAutospacing="1" w:after="100" w:afterAutospacing="1" w:line="240" w:lineRule="auto"/>
       </w:pPr>
       <w:r>
-        <w:t>Encriptación de datos</w:t>
+        <w:t xml:space="preserve">Encriptación de </w:t>
+      </w:r>
+      <w:r>
+        <w:t>las contraseñas</w:t>
       </w:r>
     </w:p>
     <w:p>
@@ -11446,6 +10839,33 @@
     </w:p>
     <w:p>
       <w:pPr>
+        <w:numPr>
+          <w:ilvl w:val="0"/>
+          <w:numId w:val="14"/>
+        </w:numPr>
+        <w:spacing w:before="100" w:beforeAutospacing="1" w:after="100" w:afterAutospacing="1" w:line="240" w:lineRule="auto"/>
+      </w:pPr>
+      <w:r>
+        <w:t xml:space="preserve">El único encargo de modificar la base de datos es el trabajador del </w:t>
+      </w:r>
+      <w:r>
+        <w:t>sistema</w:t>
+      </w:r>
+    </w:p>
+    <w:p>
+      <w:pPr>
+        <w:numPr>
+          <w:ilvl w:val="0"/>
+          <w:numId w:val="14"/>
+        </w:numPr>
+        <w:spacing w:before="100" w:beforeAutospacing="1" w:after="100" w:afterAutospacing="1" w:line="240" w:lineRule="auto"/>
+      </w:pPr>
+      <w:r>
+        <w:t>El administrador del sito es el encargado de gestionar usuarios.</w:t>
+      </w:r>
+    </w:p>
+    <w:p>
+      <w:pPr>
         <w:pStyle w:val="Textoindependiente1"/>
         <w:rPr>
           <w:sz w:val="24"/>
@@ -11453,9 +10873,17 @@
       </w:pPr>
       <w:r>
         <w:rPr>
+          <w:b/>
+          <w:bCs/>
           <w:sz w:val="24"/>
         </w:rPr>
         <w:t xml:space="preserve"> Usabilidad</w:t>
+      </w:r>
+      <w:r>
+        <w:rPr>
+          <w:sz w:val="24"/>
+        </w:rPr>
+        <w:t>: El sistema debe</w:t>
       </w:r>
     </w:p>
     <w:p>
@@ -11479,7 +10907,7 @@
         <w:spacing w:before="100" w:beforeAutospacing="1" w:after="100" w:afterAutospacing="1" w:line="240" w:lineRule="auto"/>
       </w:pPr>
       <w:r>
-        <w:t>Accesibilidad para usuarios con discapacidades</w:t>
+        <w:t>Ser accesible</w:t>
       </w:r>
     </w:p>
     <w:p>
@@ -11517,57 +10945,55 @@
         <w:rPr>
           <w:sz w:val="24"/>
         </w:rPr>
-        <w:t xml:space="preserve"> Disponibilidad</w:t>
-      </w:r>
-    </w:p>
-    <w:p>
-      <w:pPr>
-        <w:numPr>
-          <w:ilvl w:val="0"/>
-          <w:numId w:val="16"/>
-        </w:numPr>
-        <w:spacing w:before="100" w:beforeAutospacing="1" w:after="100" w:afterAutospacing="1" w:line="240" w:lineRule="auto"/>
-      </w:pPr>
-      <w:r>
-        <w:t>Tiempo de actividad esperado</w:t>
-      </w:r>
-    </w:p>
-    <w:p>
-      <w:pPr>
-        <w:numPr>
-          <w:ilvl w:val="0"/>
-          <w:numId w:val="16"/>
-        </w:numPr>
-        <w:spacing w:before="100" w:beforeAutospacing="1" w:after="100" w:afterAutospacing="1" w:line="240" w:lineRule="auto"/>
-      </w:pPr>
-      <w:r>
-        <w:t>Tiempo de inactividad planificado</w:t>
-      </w:r>
-    </w:p>
-    <w:p>
-      <w:pPr>
-        <w:numPr>
-          <w:ilvl w:val="0"/>
-          <w:numId w:val="16"/>
-        </w:numPr>
-        <w:spacing w:before="100" w:beforeAutospacing="1" w:after="100" w:afterAutospacing="1" w:line="240" w:lineRule="auto"/>
-      </w:pPr>
-      <w:r>
-        <w:t>Recuperación ante fallas</w:t>
+        <w:t xml:space="preserve"> </w:t>
+      </w:r>
+      <w:r>
+        <w:rPr>
+          <w:b/>
+          <w:bCs/>
+          <w:sz w:val="24"/>
+        </w:rPr>
+        <w:t>Disponibilidad</w:t>
+      </w:r>
+      <w:r>
+        <w:rPr>
+          <w:b/>
+          <w:bCs/>
+          <w:sz w:val="24"/>
+        </w:rPr>
+        <w:t>:</w:t>
+      </w:r>
+      <w:r>
+        <w:rPr>
+          <w:sz w:val="24"/>
+        </w:rPr>
+        <w:t xml:space="preserve"> El sistema deberá ofrecer el tiempo de actividad esperado, así como el tiempo de inactividad planificado y recuperación ante fallas.</w:t>
       </w:r>
     </w:p>
     <w:p>
       <w:pPr>
         <w:pStyle w:val="Textoindependiente1"/>
         <w:rPr>
+          <w:b/>
+          <w:bCs/>
           <w:sz w:val="24"/>
         </w:rPr>
       </w:pPr>
       <w:r>
         <w:rPr>
+          <w:b/>
+          <w:bCs/>
           <w:sz w:val="24"/>
         </w:rPr>
-        <w:t xml:space="preserve"> Fiabilidad</w:t>
+        <w:t>Fiabilidad</w:t>
+      </w:r>
+      <w:r>
+        <w:rPr>
+          <w:b/>
+          <w:bCs/>
+          <w:sz w:val="24"/>
+        </w:rPr>
+        <w:t>:</w:t>
       </w:r>
     </w:p>
     <w:p>
@@ -11670,114 +11096,13 @@
     </w:p>
     <w:p>
       <w:pPr>
-        <w:pStyle w:val="Textoindependiente1"/>
-        <w:rPr>
-          <w:sz w:val="24"/>
-        </w:rPr>
-      </w:pPr>
-      <w:r>
-        <w:rPr>
-          <w:sz w:val="24"/>
-        </w:rPr>
-        <w:t xml:space="preserve"> Portabilidad</w:t>
-      </w:r>
-    </w:p>
-    <w:p>
-      <w:pPr>
-        <w:numPr>
-          <w:ilvl w:val="0"/>
-          <w:numId w:val="19"/>
-        </w:numPr>
-        <w:spacing w:before="100" w:beforeAutospacing="1" w:after="100" w:afterAutospacing="1" w:line="240" w:lineRule="auto"/>
-      </w:pPr>
-      <w:r>
-        <w:t>Compatibilidad con diferentes sistemas operativos</w:t>
-      </w:r>
-    </w:p>
-    <w:p>
-      <w:pPr>
-        <w:numPr>
-          <w:ilvl w:val="0"/>
-          <w:numId w:val="19"/>
-        </w:numPr>
-        <w:spacing w:before="100" w:beforeAutospacing="1" w:after="100" w:afterAutospacing="1" w:line="240" w:lineRule="auto"/>
-      </w:pPr>
-      <w:r>
-        <w:t>Adaptabilidad a diferentes dispositivos</w:t>
-      </w:r>
-    </w:p>
-    <w:p>
-      <w:pPr>
-        <w:numPr>
-          <w:ilvl w:val="0"/>
-          <w:numId w:val="19"/>
-        </w:numPr>
-        <w:spacing w:before="100" w:beforeAutospacing="1" w:after="100" w:afterAutospacing="1" w:line="240" w:lineRule="auto"/>
-      </w:pPr>
-      <w:r>
-        <w:t>Interoperabilidad con otros sistemas</w:t>
-      </w:r>
-    </w:p>
-    <w:p>
-      <w:pPr>
-        <w:pStyle w:val="Textoindependiente1"/>
-        <w:rPr>
-          <w:sz w:val="24"/>
-        </w:rPr>
-      </w:pPr>
-      <w:r>
-        <w:rPr>
-          <w:sz w:val="24"/>
-        </w:rPr>
-        <w:t>Privacidad y protección de datos</w:t>
-      </w:r>
-    </w:p>
-    <w:p>
-      <w:pPr>
-        <w:numPr>
-          <w:ilvl w:val="0"/>
-          <w:numId w:val="20"/>
-        </w:numPr>
-        <w:spacing w:before="100" w:beforeAutospacing="1" w:after="100" w:afterAutospacing="1" w:line="240" w:lineRule="auto"/>
-      </w:pPr>
-      <w:r>
-        <w:t>Cumplimiento de regulaciones de protección de datos</w:t>
-      </w:r>
-    </w:p>
-    <w:p>
-      <w:pPr>
-        <w:numPr>
-          <w:ilvl w:val="0"/>
-          <w:numId w:val="20"/>
-        </w:numPr>
-        <w:spacing w:before="100" w:beforeAutospacing="1" w:after="100" w:afterAutospacing="1" w:line="240" w:lineRule="auto"/>
-      </w:pPr>
-      <w:r>
-        <w:t>Protección de información personal</w:t>
-      </w:r>
-    </w:p>
-    <w:p>
-      <w:pPr>
-        <w:numPr>
-          <w:ilvl w:val="0"/>
-          <w:numId w:val="20"/>
-        </w:numPr>
-        <w:spacing w:before="100" w:beforeAutospacing="1" w:after="100" w:afterAutospacing="1" w:line="240" w:lineRule="auto"/>
-      </w:pPr>
-      <w:r>
-        <w:t>Control sobre el uso compartido de datos</w:t>
-      </w:r>
-    </w:p>
-    <w:p>
-      <w:pPr>
         <w:pStyle w:val="Ttulo2"/>
       </w:pPr>
-      <w:bookmarkStart w:id="83" w:name="_Toc193705053"/>
-      <w:r>
-        <w:lastRenderedPageBreak/>
+      <w:bookmarkStart w:id="75" w:name="_Toc193705053"/>
+      <w:r>
         <w:t>Patrón Arquitectónico Vista-Controlador</w:t>
       </w:r>
-      <w:bookmarkEnd w:id="83"/>
+      <w:bookmarkEnd w:id="75"/>
     </w:p>
     <w:p>
       <w:pPr>
@@ -11818,7 +11143,14 @@
         <w:rPr>
           <w:lang w:val="es-CU" w:eastAsia="es-CU"/>
         </w:rPr>
-        <w:t xml:space="preserve">Representa los datos y la lógica de negocio de la aplicación, gestiona la persistencia de datos y la manipulación de datos, </w:t>
+        <w:t xml:space="preserve">Representa los datos y la lógica de negocio de la aplicación, gestiona la persistencia de datos y la manipulación de </w:t>
+      </w:r>
+      <w:r>
+        <w:rPr>
+          <w:lang w:val="es-CU" w:eastAsia="es-CU"/>
+        </w:rPr>
+        <w:lastRenderedPageBreak/>
+        <w:t xml:space="preserve">datos, </w:t>
       </w:r>
       <w:proofErr w:type="spellStart"/>
       <w:r>
@@ -11948,11 +11280,11 @@
       <w:pPr>
         <w:pStyle w:val="Ttulo2"/>
       </w:pPr>
-      <w:bookmarkStart w:id="84" w:name="_Toc193705054"/>
+      <w:bookmarkStart w:id="76" w:name="_Toc193705054"/>
       <w:r>
         <w:t>Historias de Usuarios:</w:t>
       </w:r>
-      <w:bookmarkEnd w:id="84"/>
+      <w:bookmarkEnd w:id="76"/>
     </w:p>
     <w:p>
       <w:pPr>
@@ -12223,15 +11555,7 @@
               <w:t xml:space="preserve">Descripción: </w:t>
             </w:r>
             <w:r>
-              <w:t>El módulo de autenticación debe mostrar un formulario que está compuesto por dos campos obligatorios, usuario y contraseña</w:t>
-            </w:r>
-            <w:proofErr w:type="gramStart"/>
-            <w:r>
-              <w:t>. .</w:t>
-            </w:r>
-            <w:proofErr w:type="gramEnd"/>
-            <w:r>
-              <w:t xml:space="preserve"> Cuando el usuario se autentique hará el rol de administrador o de cliente.</w:t>
+              <w:t>El módulo de autenticación debe mostrar un formulario que está compuesto por dos campos obligatorios, usuario y contraseña. . Cuando el usuario se autentique hará el rol de administrador o de cliente.</w:t>
             </w:r>
           </w:p>
         </w:tc>
@@ -12509,15 +11833,7 @@
           </w:tcPr>
           <w:p>
             <w:r>
-              <w:t>Riesgo en Desarrollo</w:t>
-            </w:r>
-            <w:proofErr w:type="gramStart"/>
-            <w:r>
-              <w:t>:  (</w:t>
-            </w:r>
-            <w:proofErr w:type="gramEnd"/>
-            <w:r>
-              <w:t>Alta/Media/ Baja)</w:t>
+              <w:t>Riesgo en Desarrollo:  (Alta/Media/ Baja)</w:t>
             </w:r>
           </w:p>
           <w:p>
@@ -12656,10 +11972,10 @@
                   <v:path o:extrusionok="f" gradientshapeok="t" o:connecttype="rect"/>
                   <o:lock v:ext="edit" aspectratio="t"/>
                 </v:shapetype>
-                <v:shape id="_x0000_i1025" type="#_x0000_t75" style="width:283.6pt;height:256.7pt" o:ole="">
+                <v:shape id="_x0000_i1025" type="#_x0000_t75" style="width:283.8pt;height:257pt" o:ole="">
                   <v:imagedata r:id="rId34" o:title=""/>
                 </v:shape>
-                <o:OLEObject Type="Embed" ProgID="PBrush" ShapeID="_x0000_i1025" DrawAspect="Content" ObjectID="_1804538513" r:id="rId35"/>
+                <o:OLEObject Type="Embed" ProgID="PBrush" ShapeID="_x0000_i1025" DrawAspect="Content" ObjectID="_1804570523" r:id="rId35"/>
               </w:object>
             </w:r>
           </w:p>
@@ -13023,11 +12339,11 @@
       <w:pPr>
         <w:pStyle w:val="Ttulo2"/>
       </w:pPr>
-      <w:bookmarkStart w:id="85" w:name="_Toc193705055"/>
+      <w:bookmarkStart w:id="77" w:name="_Toc193705055"/>
       <w:r>
         <w:t>Diagrama de Clases</w:t>
       </w:r>
-      <w:bookmarkEnd w:id="85"/>
+      <w:bookmarkEnd w:id="77"/>
       <w:r>
         <w:t xml:space="preserve"> </w:t>
       </w:r>
@@ -13132,11 +12448,11 @@
       <w:pPr>
         <w:pStyle w:val="Ttulo2"/>
       </w:pPr>
-      <w:bookmarkStart w:id="86" w:name="_Toc193705056"/>
+      <w:bookmarkStart w:id="78" w:name="_Toc193705056"/>
       <w:r>
         <w:t>Diagrama de Base de Datos</w:t>
       </w:r>
-      <w:bookmarkEnd w:id="86"/>
+      <w:bookmarkEnd w:id="78"/>
     </w:p>
     <w:p>
       <w:r>
@@ -13214,12 +12530,12 @@
       <w:pPr>
         <w:pStyle w:val="Ttulo1"/>
       </w:pPr>
-      <w:bookmarkStart w:id="87" w:name="_Toc193705057"/>
+      <w:bookmarkStart w:id="79" w:name="_Toc193705057"/>
       <w:r>
         <w:lastRenderedPageBreak/>
         <w:t>Capítulo 3. Implementación y Pruebas del Sistema</w:t>
       </w:r>
-      <w:bookmarkEnd w:id="87"/>
+      <w:bookmarkEnd w:id="79"/>
     </w:p>
     <w:p>
       <w:pPr>
@@ -13230,11 +12546,11 @@
         </w:numPr>
         <w:ind w:left="405"/>
       </w:pPr>
-      <w:bookmarkStart w:id="88" w:name="_Toc193705058"/>
+      <w:bookmarkStart w:id="80" w:name="_Toc193705058"/>
       <w:r>
         <w:t>Introducción</w:t>
       </w:r>
-      <w:bookmarkEnd w:id="88"/>
+      <w:bookmarkEnd w:id="80"/>
       <w:r>
         <w:t xml:space="preserve"> </w:t>
       </w:r>
@@ -13253,30 +12569,30 @@
           <w:vanish/>
         </w:rPr>
       </w:pPr>
-      <w:bookmarkStart w:id="89" w:name="_Toc193699580"/>
-      <w:bookmarkStart w:id="90" w:name="_Toc193705059"/>
-      <w:bookmarkEnd w:id="89"/>
-      <w:bookmarkEnd w:id="90"/>
+      <w:bookmarkStart w:id="81" w:name="_Toc193699580"/>
+      <w:bookmarkStart w:id="82" w:name="_Toc193705059"/>
+      <w:bookmarkEnd w:id="81"/>
+      <w:bookmarkEnd w:id="82"/>
     </w:p>
     <w:p>
       <w:pPr>
         <w:pStyle w:val="Ttulo2"/>
       </w:pPr>
-      <w:bookmarkStart w:id="91" w:name="_Toc193705060"/>
-      <w:commentRangeStart w:id="92"/>
+      <w:bookmarkStart w:id="83" w:name="_Toc193705060"/>
+      <w:commentRangeStart w:id="84"/>
       <w:r>
         <w:t xml:space="preserve">Pruebas al Sistema </w:t>
       </w:r>
-      <w:commentRangeEnd w:id="92"/>
+      <w:commentRangeEnd w:id="84"/>
       <w:r>
         <w:rPr>
           <w:rStyle w:val="Refdecomentario"/>
           <w:sz w:val="24"/>
           <w:szCs w:val="24"/>
         </w:rPr>
-        <w:commentReference w:id="92"/>
-      </w:r>
-      <w:bookmarkEnd w:id="91"/>
+        <w:commentReference w:id="84"/>
+      </w:r>
+      <w:bookmarkEnd w:id="83"/>
     </w:p>
     <w:p>
       <w:r>
@@ -13306,8 +12622,8 @@
           <w:lang w:eastAsia="es-ES"/>
         </w:rPr>
       </w:pPr>
-      <w:bookmarkStart w:id="93" w:name="_Toc193705061"/>
-      <w:bookmarkStart w:id="94" w:name="casoPruebaAuth"/>
+      <w:bookmarkStart w:id="85" w:name="_Toc193705061"/>
+      <w:bookmarkStart w:id="86" w:name="casoPruebaAuth"/>
       <w:r>
         <w:rPr>
           <w:rStyle w:val="Ttulo2Car"/>
@@ -13329,7 +12645,7 @@
         </w:rPr>
         <w:t>.1</w:t>
       </w:r>
-      <w:bookmarkEnd w:id="93"/>
+      <w:bookmarkEnd w:id="85"/>
       <w:r>
         <w:rPr>
           <w:rFonts w:eastAsia="Times New Roman" w:cs="Times New Roman"/>
@@ -13365,7 +12681,7 @@
             <w:shd w:val="clear" w:color="auto" w:fill="95B3D7" w:themeFill="accent1" w:themeFillTint="99"/>
             <w:hideMark/>
           </w:tcPr>
-          <w:bookmarkEnd w:id="94"/>
+          <w:bookmarkEnd w:id="86"/>
           <w:p>
             <w:pPr>
               <w:numPr>
@@ -13641,21 +12957,12 @@
                 <w:szCs w:val="20"/>
               </w:rPr>
             </w:pPr>
-            <w:proofErr w:type="gramStart"/>
             <w:r>
               <w:rPr>
                 <w:sz w:val="20"/>
                 <w:szCs w:val="20"/>
               </w:rPr>
-              <w:t>Se  registra</w:t>
-            </w:r>
-            <w:proofErr w:type="gramEnd"/>
-            <w:r>
-              <w:rPr>
-                <w:sz w:val="20"/>
-                <w:szCs w:val="20"/>
-              </w:rPr>
-              <w:t xml:space="preserve"> y entra al sistema</w:t>
+              <w:t>Se  registra y entra al sistema</w:t>
             </w:r>
           </w:p>
         </w:tc>
@@ -13780,15 +13087,7 @@
         <w:t xml:space="preserve"> las diversas formas y resultados esperados. En el primero, al entrar datos válidos el sistema permite su entrada y procede al caso dos que se calcula a partir de que el usuario presiona el botón calcular y se guardan los datos entrados en la base de datos, posterior a esto los datos serán mostrados en una tabla. En el caso tres </w:t>
       </w:r>
       <w:r>
-        <w:t xml:space="preserve">si el usuario entra un dato erróneo, ya sea letras en vez de números o cualquier datos que no es el correspondiente a esa </w:t>
-      </w:r>
-      <w:proofErr w:type="gramStart"/>
-      <w:r>
-        <w:t>entrada ,</w:t>
-      </w:r>
-      <w:proofErr w:type="gramEnd"/>
-      <w:r>
-        <w:t xml:space="preserve"> el sistema debe notificarle la mismo que el dato es incorrecto. </w:t>
+        <w:t xml:space="preserve">si el usuario entra un dato erróneo, ya sea letras en vez de números o cualquier datos que no es el correspondiente a esa entrada , el sistema debe notificarle la mismo que el dato es incorrecto. </w:t>
       </w:r>
     </w:p>
     <w:p>
@@ -13807,7 +13106,7 @@
           <w:lang w:eastAsia="es-ES"/>
         </w:rPr>
       </w:pPr>
-      <w:bookmarkStart w:id="95" w:name="_Toc193705062"/>
+      <w:bookmarkStart w:id="87" w:name="_Toc193705062"/>
       <w:r>
         <w:rPr>
           <w:rStyle w:val="Ttulo2Car"/>
@@ -13832,7 +13131,7 @@
         </w:rPr>
         <w:t>2</w:t>
       </w:r>
-      <w:bookmarkEnd w:id="95"/>
+      <w:bookmarkEnd w:id="87"/>
       <w:r>
         <w:rPr>
           <w:rFonts w:eastAsia="Times New Roman" w:cs="Times New Roman"/>
@@ -14238,30 +13537,14 @@
                 <w:sz w:val="20"/>
                 <w:szCs w:val="20"/>
               </w:rPr>
-              <w:t xml:space="preserve">dato </w:t>
-            </w:r>
-            <w:proofErr w:type="gramStart"/>
+              <w:t xml:space="preserve">dato que </w:t>
+            </w:r>
             <w:r>
               <w:rPr>
                 <w:sz w:val="20"/>
                 <w:szCs w:val="20"/>
               </w:rPr>
-              <w:t xml:space="preserve">que </w:t>
-            </w:r>
-            <w:r>
-              <w:rPr>
-                <w:sz w:val="20"/>
-                <w:szCs w:val="20"/>
-              </w:rPr>
-              <w:t xml:space="preserve"> es</w:t>
-            </w:r>
-            <w:proofErr w:type="gramEnd"/>
-            <w:r>
-              <w:rPr>
-                <w:sz w:val="20"/>
-                <w:szCs w:val="20"/>
-              </w:rPr>
-              <w:t xml:space="preserve"> incorrect</w:t>
+              <w:t xml:space="preserve"> es incorrect</w:t>
             </w:r>
             <w:r>
               <w:rPr>
@@ -14332,11 +13615,11 @@
       <w:pPr>
         <w:pStyle w:val="Ttulo2"/>
       </w:pPr>
-      <w:bookmarkStart w:id="96" w:name="_Toc193705063"/>
+      <w:bookmarkStart w:id="88" w:name="_Toc193705063"/>
       <w:r>
         <w:t>Análisis del Costo Económico</w:t>
       </w:r>
-      <w:bookmarkEnd w:id="96"/>
+      <w:bookmarkEnd w:id="88"/>
     </w:p>
     <w:p/>
     <w:p/>
@@ -14358,10 +13641,10 @@
           <w:vanish/>
         </w:rPr>
       </w:pPr>
-      <w:bookmarkStart w:id="97" w:name="_Toc193699585"/>
-      <w:bookmarkStart w:id="98" w:name="_Toc193705064"/>
-      <w:bookmarkEnd w:id="97"/>
-      <w:bookmarkEnd w:id="98"/>
+      <w:bookmarkStart w:id="89" w:name="_Toc193699585"/>
+      <w:bookmarkStart w:id="90" w:name="_Toc193705064"/>
+      <w:bookmarkEnd w:id="89"/>
+      <w:bookmarkEnd w:id="90"/>
     </w:p>
     <w:p>
       <w:pPr>
@@ -14381,10 +13664,10 @@
           <w:vanish/>
         </w:rPr>
       </w:pPr>
-      <w:bookmarkStart w:id="99" w:name="_Toc193699586"/>
-      <w:bookmarkStart w:id="100" w:name="_Toc193705065"/>
-      <w:bookmarkEnd w:id="99"/>
-      <w:bookmarkEnd w:id="100"/>
+      <w:bookmarkStart w:id="91" w:name="_Toc193699586"/>
+      <w:bookmarkStart w:id="92" w:name="_Toc193705065"/>
+      <w:bookmarkEnd w:id="91"/>
+      <w:bookmarkEnd w:id="92"/>
     </w:p>
     <w:p>
       <w:pPr>
@@ -14404,20 +13687,20 @@
           <w:vanish/>
         </w:rPr>
       </w:pPr>
-      <w:bookmarkStart w:id="101" w:name="_Toc193699587"/>
-      <w:bookmarkStart w:id="102" w:name="_Toc193705066"/>
-      <w:bookmarkEnd w:id="101"/>
-      <w:bookmarkEnd w:id="102"/>
+      <w:bookmarkStart w:id="93" w:name="_Toc193699587"/>
+      <w:bookmarkStart w:id="94" w:name="_Toc193705066"/>
+      <w:bookmarkEnd w:id="93"/>
+      <w:bookmarkEnd w:id="94"/>
     </w:p>
     <w:p>
       <w:pPr>
         <w:pStyle w:val="Ttulo3"/>
       </w:pPr>
-      <w:bookmarkStart w:id="103" w:name="_Toc193705067"/>
+      <w:bookmarkStart w:id="95" w:name="_Toc193705067"/>
       <w:r>
         <w:t>Cálculo de Puntos de Historias de Usuario sin ajustar</w:t>
       </w:r>
-      <w:bookmarkEnd w:id="103"/>
+      <w:bookmarkEnd w:id="95"/>
     </w:p>
     <w:p>
       <w:r>
@@ -14526,11 +13809,11 @@
           <w:shd w:val="clear" w:color="auto" w:fill="auto"/>
         </w:rPr>
       </w:pPr>
-      <w:bookmarkStart w:id="104" w:name="_Toc193705068"/>
+      <w:bookmarkStart w:id="96" w:name="_Toc193705068"/>
       <w:r>
         <w:t>Factor de Peso de los Actores sin ajustar (UAW)</w:t>
       </w:r>
-      <w:bookmarkEnd w:id="104"/>
+      <w:bookmarkEnd w:id="96"/>
     </w:p>
     <w:p>
       <w:pPr>
@@ -14569,7 +13852,7 @@
           <w:shd w:val="clear" w:color="auto" w:fill="auto"/>
         </w:rPr>
       </w:pPr>
-      <w:bookmarkStart w:id="105" w:name="_Toc193705069"/>
+      <w:bookmarkStart w:id="97" w:name="_Toc193705069"/>
       <w:r>
         <w:rPr>
           <w:rStyle w:val="Ttulo2Car"/>
@@ -14583,7 +13866,7 @@
         </w:rPr>
         <w:t>3</w:t>
       </w:r>
-      <w:bookmarkEnd w:id="105"/>
+      <w:bookmarkEnd w:id="97"/>
       <w:r>
         <w:rPr>
           <w:b/>
@@ -15405,11 +14688,11 @@
           <w:shd w:val="clear" w:color="auto" w:fill="auto"/>
         </w:rPr>
       </w:pPr>
-      <w:bookmarkStart w:id="106" w:name="_Toc193705070"/>
+      <w:bookmarkStart w:id="98" w:name="_Toc193705070"/>
       <w:r>
         <w:t>Factor de Peso de las Historias de Usuario sin ajustar (UUCW)</w:t>
       </w:r>
-      <w:bookmarkEnd w:id="106"/>
+      <w:bookmarkEnd w:id="98"/>
     </w:p>
     <w:p>
       <w:pPr>
@@ -16446,11 +15729,11 @@
           <w:shd w:val="clear" w:color="auto" w:fill="auto"/>
         </w:rPr>
       </w:pPr>
-      <w:bookmarkStart w:id="107" w:name="_Toc193705071"/>
+      <w:bookmarkStart w:id="99" w:name="_Toc193705071"/>
       <w:r>
         <w:t>Cálculo de los Puntos de Historias de Usuario ajustados</w:t>
       </w:r>
-      <w:bookmarkEnd w:id="107"/>
+      <w:bookmarkEnd w:id="99"/>
     </w:p>
     <w:p>
       <w:pPr>
@@ -16570,11 +15853,11 @@
       <w:pPr>
         <w:pStyle w:val="Ttulo3"/>
       </w:pPr>
-      <w:bookmarkStart w:id="108" w:name="_Toc193705072"/>
+      <w:bookmarkStart w:id="100" w:name="_Toc193705072"/>
       <w:r>
         <w:t>Factor de Complejidad Técnica (TCF)</w:t>
       </w:r>
-      <w:bookmarkEnd w:id="108"/>
+      <w:bookmarkEnd w:id="100"/>
     </w:p>
     <w:p>
       <w:pPr>
@@ -18889,11 +18172,11 @@
           <w:shd w:val="clear" w:color="auto" w:fill="auto"/>
         </w:rPr>
       </w:pPr>
-      <w:bookmarkStart w:id="109" w:name="_Toc193705073"/>
+      <w:bookmarkStart w:id="101" w:name="_Toc193705073"/>
       <w:r>
         <w:t>Factor Ambiente (EF)</w:t>
       </w:r>
-      <w:bookmarkEnd w:id="109"/>
+      <w:bookmarkEnd w:id="101"/>
     </w:p>
     <w:p>
       <w:pPr>
@@ -21831,9 +21114,9 @@
           <w:oMath/>
         </w:rPr>
       </w:pPr>
-      <w:bookmarkStart w:id="110" w:name="_Hlk193705276"/>
-    </w:p>
-    <w:bookmarkEnd w:id="110"/>
+      <w:bookmarkStart w:id="102" w:name="_Hlk193705276"/>
+    </w:p>
+    <w:bookmarkEnd w:id="102"/>
     <w:p>
       <w:pPr>
         <w:rPr>
@@ -21870,14 +21153,14 @@
       <w:pPr>
         <w:pStyle w:val="Ttulo1"/>
       </w:pPr>
-      <w:bookmarkStart w:id="111" w:name="_Toc193705074"/>
+      <w:bookmarkStart w:id="103" w:name="_Toc193705074"/>
       <w:r>
         <w:lastRenderedPageBreak/>
         <w:t>Referencias Bibliográficas</w:t>
       </w:r>
-      <w:bookmarkEnd w:id="111"/>
-    </w:p>
-    <w:bookmarkStart w:id="112" w:name="_Hlk176951345"/>
+      <w:bookmarkEnd w:id="103"/>
+    </w:p>
+    <w:bookmarkStart w:id="104" w:name="_Hlk176951345"/>
     <w:p>
       <w:pPr>
         <w:pStyle w:val="Bibliografa"/>
@@ -22458,7 +21741,7 @@
       </w:pPr>
     </w:p>
     <w:p/>
-    <w:bookmarkEnd w:id="112"/>
+    <w:bookmarkEnd w:id="104"/>
     <w:p/>
     <w:sectPr>
       <w:pgSz w:w="12240" w:h="15840" w:code="1"/>
@@ -22813,208 +22096,11 @@
         <w:annotationRef/>
       </w:r>
       <w:r>
-        <w:t xml:space="preserve">Se cambio Usuario por </w:t>
-      </w:r>
-      <w:proofErr w:type="gramStart"/>
-      <w:r>
-        <w:t>Trabajador..</w:t>
-      </w:r>
-      <w:proofErr w:type="gramEnd"/>
-      <w:r>
-        <w:t xml:space="preserve"> Usuarios son todos </w:t>
+        <w:t xml:space="preserve">Se cambio Usuario por Trabajador.. Usuarios son todos </w:t>
       </w:r>
     </w:p>
   </w:comment>
-  <w:comment w:id="76" w:author="Dionis" w:date="2024-12-10T06:42:00Z" w:initials="D">
-    <w:p>
-      <w:pPr>
-        <w:pStyle w:val="Textocomentario"/>
-      </w:pPr>
-      <w:r>
-        <w:rPr>
-          <w:rStyle w:val="Refdecomentario"/>
-        </w:rPr>
-        <w:annotationRef/>
-      </w:r>
-      <w:r>
-        <w:t>El sistema debe</w:t>
-      </w:r>
-    </w:p>
-    <w:p>
-      <w:pPr>
-        <w:pStyle w:val="Textocomentario"/>
-      </w:pPr>
-    </w:p>
-    <w:p>
-      <w:pPr>
-        <w:pStyle w:val="Textocomentario"/>
-      </w:pPr>
-      <w:r>
-        <w:t xml:space="preserve">Esto de esta forma dejarlo para las Historias de </w:t>
-      </w:r>
-      <w:proofErr w:type="spellStart"/>
-      <w:r>
-        <w:t>Usario</w:t>
-      </w:r>
-      <w:proofErr w:type="spellEnd"/>
-    </w:p>
-    <w:p>
-      <w:pPr>
-        <w:pStyle w:val="Textocomentario"/>
-      </w:pPr>
-    </w:p>
-    <w:p>
-      <w:pPr>
-        <w:pStyle w:val="Textocomentario"/>
-      </w:pPr>
-      <w:r>
-        <w:t>REVISAR otras tesis.</w:t>
-      </w:r>
-    </w:p>
-  </w:comment>
-  <w:comment w:id="77" w:author="TitoCode" w:date="2024-12-16T09:42:00Z" w:initials="T">
-    <w:p>
-      <w:pPr>
-        <w:pStyle w:val="Textocomentario"/>
-      </w:pPr>
-      <w:r>
-        <w:rPr>
-          <w:rStyle w:val="Refdecomentario"/>
-        </w:rPr>
-        <w:annotationRef/>
-      </w:r>
-      <w:r>
-        <w:t>Logrado</w:t>
-      </w:r>
-    </w:p>
-  </w:comment>
-  <w:comment w:id="78" w:author="Dionis" w:date="2024-12-10T06:42:00Z" w:initials="D">
-    <w:p>
-      <w:pPr>
-        <w:pStyle w:val="Textocomentario"/>
-      </w:pPr>
-      <w:r>
-        <w:rPr>
-          <w:rStyle w:val="Refdecomentario"/>
-        </w:rPr>
-        <w:annotationRef/>
-      </w:r>
-      <w:r>
-        <w:t>El sistema debe</w:t>
-      </w:r>
-    </w:p>
-    <w:p>
-      <w:pPr>
-        <w:pStyle w:val="Textocomentario"/>
-      </w:pPr>
-    </w:p>
-    <w:p>
-      <w:pPr>
-        <w:pStyle w:val="Textocomentario"/>
-      </w:pPr>
-      <w:r>
-        <w:t xml:space="preserve">Esto de esta forma dejarlo para las Historias de </w:t>
-      </w:r>
-      <w:proofErr w:type="spellStart"/>
-      <w:r>
-        <w:t>Usario</w:t>
-      </w:r>
-      <w:proofErr w:type="spellEnd"/>
-    </w:p>
-    <w:p>
-      <w:pPr>
-        <w:pStyle w:val="Textocomentario"/>
-      </w:pPr>
-    </w:p>
-    <w:p>
-      <w:pPr>
-        <w:pStyle w:val="Textocomentario"/>
-      </w:pPr>
-      <w:r>
-        <w:t>REVISAR otras tesis.</w:t>
-      </w:r>
-    </w:p>
-  </w:comment>
-  <w:comment w:id="79" w:author="TitoCode" w:date="2024-12-16T09:39:00Z" w:initials="T">
-    <w:p>
-      <w:pPr>
-        <w:pStyle w:val="Textocomentario"/>
-      </w:pPr>
-      <w:r>
-        <w:rPr>
-          <w:rStyle w:val="Refdecomentario"/>
-        </w:rPr>
-        <w:annotationRef/>
-      </w:r>
-      <w:r>
-        <w:t>Logrado</w:t>
-      </w:r>
-    </w:p>
-  </w:comment>
-  <w:comment w:id="80" w:author="Dionis" w:date="2024-12-10T06:42:00Z" w:initials="D">
-    <w:p>
-      <w:pPr>
-        <w:pStyle w:val="Textocomentario"/>
-      </w:pPr>
-      <w:r>
-        <w:rPr>
-          <w:rStyle w:val="Refdecomentario"/>
-        </w:rPr>
-        <w:annotationRef/>
-      </w:r>
-      <w:r>
-        <w:t>El sistema debe</w:t>
-      </w:r>
-    </w:p>
-    <w:p>
-      <w:pPr>
-        <w:pStyle w:val="Textocomentario"/>
-      </w:pPr>
-    </w:p>
-    <w:p>
-      <w:pPr>
-        <w:pStyle w:val="Textocomentario"/>
-      </w:pPr>
-      <w:r>
-        <w:t xml:space="preserve">Esto de esta forma dejarlo para las Historias de </w:t>
-      </w:r>
-      <w:proofErr w:type="spellStart"/>
-      <w:r>
-        <w:t>Usario</w:t>
-      </w:r>
-      <w:proofErr w:type="spellEnd"/>
-    </w:p>
-    <w:p>
-      <w:pPr>
-        <w:pStyle w:val="Textocomentario"/>
-      </w:pPr>
-    </w:p>
-    <w:p>
-      <w:pPr>
-        <w:pStyle w:val="Textocomentario"/>
-      </w:pPr>
-      <w:r>
-        <w:t>REVISAR otras tesis.</w:t>
-      </w:r>
-    </w:p>
-  </w:comment>
-  <w:comment w:id="81" w:author="TitoCode" w:date="2024-12-16T09:38:00Z" w:initials="T">
-    <w:p>
-      <w:pPr>
-        <w:pStyle w:val="Textocomentario"/>
-      </w:pPr>
-      <w:r>
-        <w:rPr>
-          <w:rStyle w:val="Refdecomentario"/>
-        </w:rPr>
-        <w:annotationRef/>
-      </w:r>
-      <w:r>
-        <w:t>Logrado</w:t>
-      </w:r>
-    </w:p>
-  </w:comment>
-  <w:comment w:id="92" w:author="Dionis" w:date="2024-12-10T06:42:00Z" w:initials="D">
+  <w:comment w:id="84" w:author="Dionis" w:date="2024-12-10T06:42:00Z" w:initials="D">
     <w:p>
       <w:pPr>
         <w:pStyle w:val="Textocomentario"/>
@@ -23058,12 +22144,6 @@
   <w15:commentEx w15:paraId="086F8487" w15:done="0"/>
   <w15:commentEx w15:paraId="66258C1F" w15:paraIdParent="086F8487" w15:done="0"/>
   <w15:commentEx w15:paraId="1A7EA011" w15:done="0"/>
-  <w15:commentEx w15:paraId="7EA74B4A" w15:done="0"/>
-  <w15:commentEx w15:paraId="7542B0AB" w15:paraIdParent="7EA74B4A" w15:done="0"/>
-  <w15:commentEx w15:paraId="6BBAA6C3" w15:done="0"/>
-  <w15:commentEx w15:paraId="74F2875F" w15:paraIdParent="6BBAA6C3" w15:done="0"/>
-  <w15:commentEx w15:paraId="168DDC0F" w15:done="0"/>
-  <w15:commentEx w15:paraId="50548355" w15:paraIdParent="168DDC0F" w15:done="0"/>
   <w15:commentEx w15:paraId="17AF30BB" w15:done="0"/>
 </w15:commentsEx>
 </file>
@@ -23085,12 +22165,6 @@
   <w16cex:commentExtensible w16cex:durableId="1C85B6E0" w16cex:dateUtc="2024-12-10T11:40:00Z"/>
   <w16cex:commentExtensible w16cex:durableId="2B0A71D2" w16cex:dateUtc="2024-12-16T14:30:00Z"/>
   <w16cex:commentExtensible w16cex:durableId="2B0A750F" w16cex:dateUtc="2024-12-16T14:44:00Z"/>
-  <w16cex:commentExtensible w16cex:durableId="01D79DAE" w16cex:dateUtc="2024-12-10T11:42:00Z"/>
-  <w16cex:commentExtensible w16cex:durableId="2B0A7491" w16cex:dateUtc="2024-12-16T14:42:00Z"/>
-  <w16cex:commentExtensible w16cex:durableId="2B0A728C" w16cex:dateUtc="2024-12-10T11:42:00Z"/>
-  <w16cex:commentExtensible w16cex:durableId="2B0A73B6" w16cex:dateUtc="2024-12-16T14:39:00Z"/>
-  <w16cex:commentExtensible w16cex:durableId="2B0A72CF" w16cex:dateUtc="2024-12-10T11:42:00Z"/>
-  <w16cex:commentExtensible w16cex:durableId="2B0A73AF" w16cex:dateUtc="2024-12-16T14:38:00Z"/>
   <w16cex:commentExtensible w16cex:durableId="7FB1B1B0" w16cex:dateUtc="2024-12-10T11:42:00Z"/>
 </w16cex:commentsExtensible>
 </file>
@@ -23112,12 +22186,6 @@
   <w16cid:commentId w16cid:paraId="086F8487" w16cid:durableId="1C85B6E0"/>
   <w16cid:commentId w16cid:paraId="66258C1F" w16cid:durableId="2B0A71D2"/>
   <w16cid:commentId w16cid:paraId="1A7EA011" w16cid:durableId="2B0A750F"/>
-  <w16cid:commentId w16cid:paraId="7EA74B4A" w16cid:durableId="01D79DAE"/>
-  <w16cid:commentId w16cid:paraId="7542B0AB" w16cid:durableId="2B0A7491"/>
-  <w16cid:commentId w16cid:paraId="6BBAA6C3" w16cid:durableId="2B0A728C"/>
-  <w16cid:commentId w16cid:paraId="74F2875F" w16cid:durableId="2B0A73B6"/>
-  <w16cid:commentId w16cid:paraId="168DDC0F" w16cid:durableId="2B0A72CF"/>
-  <w16cid:commentId w16cid:paraId="50548355" w16cid:durableId="2B0A73AF"/>
   <w16cid:commentId w16cid:paraId="17AF30BB" w16cid:durableId="7FB1B1B0"/>
 </w16cid:commentsIds>
 </file>
@@ -25687,6 +24755,119 @@
     </w:lvl>
   </w:abstractNum>
   <w:abstractNum w:abstractNumId="21" w15:restartNumberingAfterBreak="0">
+    <w:nsid w:val="4A4E6987"/>
+    <w:multiLevelType w:val="hybridMultilevel"/>
+    <w:tmpl w:val="6CAECA3A"/>
+    <w:lvl w:ilvl="0" w:tplc="5C0A000B">
+      <w:start w:val="1"/>
+      <w:numFmt w:val="bullet"/>
+      <w:lvlText w:val=""/>
+      <w:lvlJc w:val="left"/>
+      <w:pPr>
+        <w:ind w:left="720" w:hanging="360"/>
+      </w:pPr>
+      <w:rPr>
+        <w:rFonts w:ascii="Wingdings" w:hAnsi="Wingdings" w:hint="default"/>
+      </w:rPr>
+    </w:lvl>
+    <w:lvl w:ilvl="1" w:tplc="5C0A0003" w:tentative="1">
+      <w:start w:val="1"/>
+      <w:numFmt w:val="bullet"/>
+      <w:lvlText w:val="o"/>
+      <w:lvlJc w:val="left"/>
+      <w:pPr>
+        <w:ind w:left="1440" w:hanging="360"/>
+      </w:pPr>
+      <w:rPr>
+        <w:rFonts w:ascii="Courier New" w:hAnsi="Courier New" w:cs="Courier New" w:hint="default"/>
+      </w:rPr>
+    </w:lvl>
+    <w:lvl w:ilvl="2" w:tplc="5C0A0005" w:tentative="1">
+      <w:start w:val="1"/>
+      <w:numFmt w:val="bullet"/>
+      <w:lvlText w:val=""/>
+      <w:lvlJc w:val="left"/>
+      <w:pPr>
+        <w:ind w:left="2160" w:hanging="360"/>
+      </w:pPr>
+      <w:rPr>
+        <w:rFonts w:ascii="Wingdings" w:hAnsi="Wingdings" w:hint="default"/>
+      </w:rPr>
+    </w:lvl>
+    <w:lvl w:ilvl="3" w:tplc="5C0A0001" w:tentative="1">
+      <w:start w:val="1"/>
+      <w:numFmt w:val="bullet"/>
+      <w:lvlText w:val=""/>
+      <w:lvlJc w:val="left"/>
+      <w:pPr>
+        <w:ind w:left="2880" w:hanging="360"/>
+      </w:pPr>
+      <w:rPr>
+        <w:rFonts w:ascii="Symbol" w:hAnsi="Symbol" w:hint="default"/>
+      </w:rPr>
+    </w:lvl>
+    <w:lvl w:ilvl="4" w:tplc="5C0A0003" w:tentative="1">
+      <w:start w:val="1"/>
+      <w:numFmt w:val="bullet"/>
+      <w:lvlText w:val="o"/>
+      <w:lvlJc w:val="left"/>
+      <w:pPr>
+        <w:ind w:left="3600" w:hanging="360"/>
+      </w:pPr>
+      <w:rPr>
+        <w:rFonts w:ascii="Courier New" w:hAnsi="Courier New" w:cs="Courier New" w:hint="default"/>
+      </w:rPr>
+    </w:lvl>
+    <w:lvl w:ilvl="5" w:tplc="5C0A0005" w:tentative="1">
+      <w:start w:val="1"/>
+      <w:numFmt w:val="bullet"/>
+      <w:lvlText w:val=""/>
+      <w:lvlJc w:val="left"/>
+      <w:pPr>
+        <w:ind w:left="4320" w:hanging="360"/>
+      </w:pPr>
+      <w:rPr>
+        <w:rFonts w:ascii="Wingdings" w:hAnsi="Wingdings" w:hint="default"/>
+      </w:rPr>
+    </w:lvl>
+    <w:lvl w:ilvl="6" w:tplc="5C0A0001" w:tentative="1">
+      <w:start w:val="1"/>
+      <w:numFmt w:val="bullet"/>
+      <w:lvlText w:val=""/>
+      <w:lvlJc w:val="left"/>
+      <w:pPr>
+        <w:ind w:left="5040" w:hanging="360"/>
+      </w:pPr>
+      <w:rPr>
+        <w:rFonts w:ascii="Symbol" w:hAnsi="Symbol" w:hint="default"/>
+      </w:rPr>
+    </w:lvl>
+    <w:lvl w:ilvl="7" w:tplc="5C0A0003" w:tentative="1">
+      <w:start w:val="1"/>
+      <w:numFmt w:val="bullet"/>
+      <w:lvlText w:val="o"/>
+      <w:lvlJc w:val="left"/>
+      <w:pPr>
+        <w:ind w:left="5760" w:hanging="360"/>
+      </w:pPr>
+      <w:rPr>
+        <w:rFonts w:ascii="Courier New" w:hAnsi="Courier New" w:cs="Courier New" w:hint="default"/>
+      </w:rPr>
+    </w:lvl>
+    <w:lvl w:ilvl="8" w:tplc="5C0A0005" w:tentative="1">
+      <w:start w:val="1"/>
+      <w:numFmt w:val="bullet"/>
+      <w:lvlText w:val=""/>
+      <w:lvlJc w:val="left"/>
+      <w:pPr>
+        <w:ind w:left="6480" w:hanging="360"/>
+      </w:pPr>
+      <w:rPr>
+        <w:rFonts w:ascii="Wingdings" w:hAnsi="Wingdings" w:hint="default"/>
+      </w:rPr>
+    </w:lvl>
+  </w:abstractNum>
+  <w:abstractNum w:abstractNumId="22" w15:restartNumberingAfterBreak="0">
     <w:nsid w:val="4B61053E"/>
     <w:multiLevelType w:val="hybridMultilevel"/>
     <w:tmpl w:val="A07C533A"/>
@@ -25799,7 +24980,7 @@
       </w:rPr>
     </w:lvl>
   </w:abstractNum>
-  <w:abstractNum w:abstractNumId="22" w15:restartNumberingAfterBreak="0">
+  <w:abstractNum w:abstractNumId="23" w15:restartNumberingAfterBreak="0">
     <w:nsid w:val="4CDC4D36"/>
     <w:multiLevelType w:val="hybridMultilevel"/>
     <w:tmpl w:val="A4DC3A2E"/>
@@ -25913,7 +25094,7 @@
       </w:rPr>
     </w:lvl>
   </w:abstractNum>
-  <w:abstractNum w:abstractNumId="23" w15:restartNumberingAfterBreak="0">
+  <w:abstractNum w:abstractNumId="24" w15:restartNumberingAfterBreak="0">
     <w:nsid w:val="50AD4D7E"/>
     <w:multiLevelType w:val="hybridMultilevel"/>
     <w:tmpl w:val="29B0C2E0"/>
@@ -26027,7 +25208,7 @@
       </w:rPr>
     </w:lvl>
   </w:abstractNum>
-  <w:abstractNum w:abstractNumId="24" w15:restartNumberingAfterBreak="0">
+  <w:abstractNum w:abstractNumId="25" w15:restartNumberingAfterBreak="0">
     <w:nsid w:val="516A0573"/>
     <w:multiLevelType w:val="hybridMultilevel"/>
     <w:tmpl w:val="6B6CACC6"/>
@@ -26140,7 +25321,7 @@
       </w:rPr>
     </w:lvl>
   </w:abstractNum>
-  <w:abstractNum w:abstractNumId="25" w15:restartNumberingAfterBreak="0">
+  <w:abstractNum w:abstractNumId="26" w15:restartNumberingAfterBreak="0">
     <w:nsid w:val="534E27AE"/>
     <w:multiLevelType w:val="multilevel"/>
     <w:tmpl w:val="4864874A"/>
@@ -26232,7 +25413,7 @@
       </w:pPr>
     </w:lvl>
   </w:abstractNum>
-  <w:abstractNum w:abstractNumId="26" w15:restartNumberingAfterBreak="0">
+  <w:abstractNum w:abstractNumId="27" w15:restartNumberingAfterBreak="0">
     <w:nsid w:val="59357C29"/>
     <w:multiLevelType w:val="hybridMultilevel"/>
     <w:tmpl w:val="A00C5C94"/>
@@ -26345,7 +25526,7 @@
       </w:rPr>
     </w:lvl>
   </w:abstractNum>
-  <w:abstractNum w:abstractNumId="27" w15:restartNumberingAfterBreak="0">
+  <w:abstractNum w:abstractNumId="28" w15:restartNumberingAfterBreak="0">
     <w:nsid w:val="59A97D46"/>
     <w:multiLevelType w:val="hybridMultilevel"/>
     <w:tmpl w:val="89B20D34"/>
@@ -26458,7 +25639,7 @@
       </w:rPr>
     </w:lvl>
   </w:abstractNum>
-  <w:abstractNum w:abstractNumId="28" w15:restartNumberingAfterBreak="0">
+  <w:abstractNum w:abstractNumId="29" w15:restartNumberingAfterBreak="0">
     <w:nsid w:val="5C492990"/>
     <w:multiLevelType w:val="multilevel"/>
     <w:tmpl w:val="8C869662"/>
@@ -26607,7 +25788,7 @@
       </w:rPr>
     </w:lvl>
   </w:abstractNum>
-  <w:abstractNum w:abstractNumId="29" w15:restartNumberingAfterBreak="0">
+  <w:abstractNum w:abstractNumId="30" w15:restartNumberingAfterBreak="0">
     <w:nsid w:val="6332387A"/>
     <w:multiLevelType w:val="multilevel"/>
     <w:tmpl w:val="CE227F9A"/>
@@ -26756,7 +25937,7 @@
       </w:rPr>
     </w:lvl>
   </w:abstractNum>
-  <w:abstractNum w:abstractNumId="30" w15:restartNumberingAfterBreak="0">
+  <w:abstractNum w:abstractNumId="31" w15:restartNumberingAfterBreak="0">
     <w:nsid w:val="645D0617"/>
     <w:multiLevelType w:val="multilevel"/>
     <w:tmpl w:val="B9D0D63C"/>
@@ -26905,7 +26086,7 @@
       </w:rPr>
     </w:lvl>
   </w:abstractNum>
-  <w:abstractNum w:abstractNumId="31" w15:restartNumberingAfterBreak="0">
+  <w:abstractNum w:abstractNumId="32" w15:restartNumberingAfterBreak="0">
     <w:nsid w:val="678D4A83"/>
     <w:multiLevelType w:val="hybridMultilevel"/>
     <w:tmpl w:val="8D66037A"/>
@@ -27018,7 +26199,7 @@
       </w:rPr>
     </w:lvl>
   </w:abstractNum>
-  <w:abstractNum w:abstractNumId="32" w15:restartNumberingAfterBreak="0">
+  <w:abstractNum w:abstractNumId="33" w15:restartNumberingAfterBreak="0">
     <w:nsid w:val="67AD18D2"/>
     <w:multiLevelType w:val="multilevel"/>
     <w:tmpl w:val="3410CB8C"/>
@@ -27132,7 +26313,7 @@
       </w:rPr>
     </w:lvl>
   </w:abstractNum>
-  <w:abstractNum w:abstractNumId="33" w15:restartNumberingAfterBreak="0">
+  <w:abstractNum w:abstractNumId="34" w15:restartNumberingAfterBreak="0">
     <w:nsid w:val="6DBB7452"/>
     <w:multiLevelType w:val="multilevel"/>
     <w:tmpl w:val="7FF09C80"/>
@@ -27281,7 +26462,7 @@
       </w:rPr>
     </w:lvl>
   </w:abstractNum>
-  <w:abstractNum w:abstractNumId="34" w15:restartNumberingAfterBreak="0">
+  <w:abstractNum w:abstractNumId="35" w15:restartNumberingAfterBreak="0">
     <w:nsid w:val="70442DED"/>
     <w:multiLevelType w:val="multilevel"/>
     <w:tmpl w:val="4DBA6AE6"/>
@@ -27430,7 +26611,7 @@
       </w:rPr>
     </w:lvl>
   </w:abstractNum>
-  <w:abstractNum w:abstractNumId="35" w15:restartNumberingAfterBreak="0">
+  <w:abstractNum w:abstractNumId="36" w15:restartNumberingAfterBreak="0">
     <w:nsid w:val="711914F5"/>
     <w:multiLevelType w:val="multilevel"/>
     <w:tmpl w:val="6D68B112"/>
@@ -27579,7 +26760,7 @@
       </w:rPr>
     </w:lvl>
   </w:abstractNum>
-  <w:abstractNum w:abstractNumId="36" w15:restartNumberingAfterBreak="0">
+  <w:abstractNum w:abstractNumId="37" w15:restartNumberingAfterBreak="0">
     <w:nsid w:val="754E7517"/>
     <w:multiLevelType w:val="hybridMultilevel"/>
     <w:tmpl w:val="6DB8A8AA"/>
@@ -27692,7 +26873,7 @@
       </w:rPr>
     </w:lvl>
   </w:abstractNum>
-  <w:abstractNum w:abstractNumId="37" w15:restartNumberingAfterBreak="0">
+  <w:abstractNum w:abstractNumId="38" w15:restartNumberingAfterBreak="0">
     <w:nsid w:val="765860BC"/>
     <w:multiLevelType w:val="hybridMultilevel"/>
     <w:tmpl w:val="9A72A908"/>
@@ -27805,7 +26986,7 @@
       </w:rPr>
     </w:lvl>
   </w:abstractNum>
-  <w:abstractNum w:abstractNumId="38" w15:restartNumberingAfterBreak="0">
+  <w:abstractNum w:abstractNumId="39" w15:restartNumberingAfterBreak="0">
     <w:nsid w:val="78216ECD"/>
     <w:multiLevelType w:val="hybridMultilevel"/>
     <w:tmpl w:val="4AB21884"/>
@@ -27896,7 +27077,7 @@
       </w:pPr>
     </w:lvl>
   </w:abstractNum>
-  <w:abstractNum w:abstractNumId="39" w15:restartNumberingAfterBreak="0">
+  <w:abstractNum w:abstractNumId="40" w15:restartNumberingAfterBreak="0">
     <w:nsid w:val="7A5D0759"/>
     <w:multiLevelType w:val="hybridMultilevel"/>
     <w:tmpl w:val="0C08EEFE"/>
@@ -28009,7 +27190,7 @@
       </w:rPr>
     </w:lvl>
   </w:abstractNum>
-  <w:abstractNum w:abstractNumId="40" w15:restartNumberingAfterBreak="0">
+  <w:abstractNum w:abstractNumId="41" w15:restartNumberingAfterBreak="0">
     <w:nsid w:val="7AC77673"/>
     <w:multiLevelType w:val="multilevel"/>
     <w:tmpl w:val="D8EC9284"/>
@@ -28123,7 +27304,7 @@
       </w:rPr>
     </w:lvl>
   </w:abstractNum>
-  <w:abstractNum w:abstractNumId="41" w15:restartNumberingAfterBreak="0">
+  <w:abstractNum w:abstractNumId="42" w15:restartNumberingAfterBreak="0">
     <w:nsid w:val="7E085875"/>
     <w:multiLevelType w:val="hybridMultilevel"/>
     <w:tmpl w:val="6C542E02"/>
@@ -28237,13 +27418,13 @@
     </w:lvl>
   </w:abstractNum>
   <w:num w:numId="1">
-    <w:abstractNumId w:val="37"/>
+    <w:abstractNumId w:val="38"/>
   </w:num>
   <w:num w:numId="2">
-    <w:abstractNumId w:val="26"/>
+    <w:abstractNumId w:val="27"/>
   </w:num>
   <w:num w:numId="3">
-    <w:abstractNumId w:val="23"/>
+    <w:abstractNumId w:val="24"/>
   </w:num>
   <w:num w:numId="4">
     <w:abstractNumId w:val="8"/>
@@ -28252,7 +27433,7 @@
     <w:abstractNumId w:val="14"/>
   </w:num>
   <w:num w:numId="6">
-    <w:abstractNumId w:val="22"/>
+    <w:abstractNumId w:val="23"/>
   </w:num>
   <w:num w:numId="7">
     <w:abstractNumId w:val="19"/>
@@ -28261,10 +27442,10 @@
     <w:abstractNumId w:val="12"/>
   </w:num>
   <w:num w:numId="9">
-    <w:abstractNumId w:val="36"/>
+    <w:abstractNumId w:val="37"/>
   </w:num>
   <w:num w:numId="10">
-    <w:abstractNumId w:val="31"/>
+    <w:abstractNumId w:val="32"/>
   </w:num>
   <w:num w:numId="11">
     <w:abstractNumId w:val="18"/>
@@ -28273,25 +27454,25 @@
     <w:abstractNumId w:val="11"/>
   </w:num>
   <w:num w:numId="13">
-    <w:abstractNumId w:val="28"/>
+    <w:abstractNumId w:val="29"/>
   </w:num>
   <w:num w:numId="14">
     <w:abstractNumId w:val="5"/>
   </w:num>
   <w:num w:numId="15">
-    <w:abstractNumId w:val="34"/>
+    <w:abstractNumId w:val="35"/>
   </w:num>
   <w:num w:numId="16">
-    <w:abstractNumId w:val="29"/>
+    <w:abstractNumId w:val="30"/>
   </w:num>
   <w:num w:numId="17">
     <w:abstractNumId w:val="10"/>
   </w:num>
   <w:num w:numId="18">
-    <w:abstractNumId w:val="35"/>
+    <w:abstractNumId w:val="36"/>
   </w:num>
   <w:num w:numId="19">
-    <w:abstractNumId w:val="33"/>
+    <w:abstractNumId w:val="34"/>
   </w:num>
   <w:num w:numId="20">
     <w:abstractNumId w:val="2"/>
@@ -28306,31 +27487,31 @@
     <w:abstractNumId w:val="7"/>
   </w:num>
   <w:num w:numId="24">
-    <w:abstractNumId w:val="24"/>
+    <w:abstractNumId w:val="25"/>
   </w:num>
   <w:num w:numId="25">
     <w:abstractNumId w:val="13"/>
   </w:num>
   <w:num w:numId="26">
-    <w:abstractNumId w:val="30"/>
+    <w:abstractNumId w:val="31"/>
   </w:num>
   <w:num w:numId="27">
     <w:abstractNumId w:val="9"/>
   </w:num>
   <w:num w:numId="28">
-    <w:abstractNumId w:val="40"/>
+    <w:abstractNumId w:val="41"/>
   </w:num>
   <w:num w:numId="29">
     <w:abstractNumId w:val="3"/>
   </w:num>
   <w:num w:numId="30">
-    <w:abstractNumId w:val="32"/>
+    <w:abstractNumId w:val="33"/>
   </w:num>
   <w:num w:numId="31">
     <w:abstractNumId w:val="0"/>
   </w:num>
   <w:num w:numId="32">
-    <w:abstractNumId w:val="38"/>
+    <w:abstractNumId w:val="39"/>
     <w:lvlOverride w:ilvl="0">
       <w:startOverride w:val="1"/>
     </w:lvlOverride>
@@ -28360,7 +27541,7 @@
     </w:lvlOverride>
   </w:num>
   <w:num w:numId="33">
-    <w:abstractNumId w:val="25"/>
+    <w:abstractNumId w:val="26"/>
     <w:lvlOverride w:ilvl="0">
       <w:startOverride w:val="3"/>
     </w:lvlOverride>
@@ -28390,7 +27571,7 @@
     </w:lvlOverride>
   </w:num>
   <w:num w:numId="34">
-    <w:abstractNumId w:val="39"/>
+    <w:abstractNumId w:val="40"/>
   </w:num>
   <w:num w:numId="35">
     <w:abstractNumId w:val="4"/>
@@ -28432,7 +27613,7 @@
     <w:abstractNumId w:val="1"/>
   </w:num>
   <w:num w:numId="39">
-    <w:abstractNumId w:val="27"/>
+    <w:abstractNumId w:val="28"/>
   </w:num>
   <w:num w:numId="40">
     <w:abstractNumId w:val="16"/>
@@ -28441,7 +27622,7 @@
     <w:abstractNumId w:val="6"/>
   </w:num>
   <w:num w:numId="42">
-    <w:abstractNumId w:val="41"/>
+    <w:abstractNumId w:val="42"/>
   </w:num>
   <w:num w:numId="43">
     <w:abstractNumId w:val="4"/>
@@ -28474,6 +27655,9 @@
     </w:lvlOverride>
   </w:num>
   <w:num w:numId="44">
+    <w:abstractNumId w:val="22"/>
+  </w:num>
+  <w:num w:numId="45">
     <w:abstractNumId w:val="21"/>
   </w:num>
   <w:numIdMacAtCleanup w:val="31"/>

</xml_diff>

<commit_message>
Historias de Usuario Actualizadas Informe de Tesis
</commit_message>
<xml_diff>
--- a/DOC/Tesis Dariel Enmanuel Cabrera Lopez.docx
+++ b/DOC/Tesis Dariel Enmanuel Cabrera Lopez.docx
@@ -7149,7 +7149,21 @@
         <w:rPr>
           <w:rFonts w:ascii="Arial" w:hAnsi="Arial" w:cs="Arial"/>
         </w:rPr>
-        <w:t>Cuenta con servicio web pero no ofrece todas las funcionalidades que su versión de escritorio.</w:t>
+        <w:t xml:space="preserve">Cuenta con servicio </w:t>
+      </w:r>
+      <w:proofErr w:type="gramStart"/>
+      <w:r>
+        <w:rPr>
+          <w:rFonts w:ascii="Arial" w:hAnsi="Arial" w:cs="Arial"/>
+        </w:rPr>
+        <w:t>web</w:t>
+      </w:r>
+      <w:proofErr w:type="gramEnd"/>
+      <w:r>
+        <w:rPr>
+          <w:rFonts w:ascii="Arial" w:hAnsi="Arial" w:cs="Arial"/>
+        </w:rPr>
+        <w:t xml:space="preserve"> pero no ofrece todas las funcionalidades que su versión de escritorio.</w:t>
       </w:r>
     </w:p>
     <w:p>
@@ -7450,8 +7464,16 @@
         <w:rPr>
           <w:rFonts w:ascii="Arial" w:hAnsi="Arial" w:cs="Arial"/>
         </w:rPr>
-        <w:t xml:space="preserve"> y  Linux</w:t>
-      </w:r>
+        <w:t xml:space="preserve"> </w:t>
+      </w:r>
+      <w:proofErr w:type="gramStart"/>
+      <w:r>
+        <w:rPr>
+          <w:rFonts w:ascii="Arial" w:hAnsi="Arial" w:cs="Arial"/>
+        </w:rPr>
+        <w:t>y  Linux</w:t>
+      </w:r>
+      <w:proofErr w:type="gramEnd"/>
     </w:p>
     <w:p>
       <w:pPr>
@@ -8740,10 +8762,18 @@
         <w:t>Se escogió este EDI ya que es el más usado para desarrollar aplicaciones en cualquier lenguaje, es bastante completo, además de las extensiones que tien</w:t>
       </w:r>
       <w:r>
-        <w:t xml:space="preserve">en que la ayudan mucho a la hora </w:t>
-      </w:r>
-      <w:r>
-        <w:t xml:space="preserve"> de codificar</w:t>
+        <w:t xml:space="preserve">en que la ayudan mucho a la </w:t>
+      </w:r>
+      <w:proofErr w:type="gramStart"/>
+      <w:r>
+        <w:t xml:space="preserve">hora </w:t>
+      </w:r>
+      <w:r>
+        <w:t xml:space="preserve"> de</w:t>
+      </w:r>
+      <w:proofErr w:type="gramEnd"/>
+      <w:r>
+        <w:t xml:space="preserve"> codificar</w:t>
       </w:r>
       <w:r>
         <w:t>.</w:t>
@@ -9141,8 +9171,13 @@
         <w:lastRenderedPageBreak/>
         <w:t xml:space="preserve">programas de red altamente escalables, </w:t>
       </w:r>
-      <w:r>
-        <w:t xml:space="preserve">como </w:t>
+      <w:proofErr w:type="gramStart"/>
+      <w:r>
+        <w:t>como</w:t>
+      </w:r>
+      <w:proofErr w:type="gramEnd"/>
+      <w:r>
+        <w:t xml:space="preserve"> </w:t>
       </w:r>
       <w:r>
         <w:t xml:space="preserve">por ejemplo, servidores web. Fue creado por Ryan Dahl en 2009 y su evolución está apadrinada por la empresa </w:t>
@@ -9919,7 +9954,15 @@
         <w:t>Codificación</w:t>
       </w:r>
       <w:r>
-        <w:t>: Después de que las historias han sido desarrolladas y de que se ha hecho el trabajo de diseño preliminar, el equipo no inicia la codificación, sino que desarrolla una serie de pruebas unitarias a cada una de las historias que se van a incluir en la entrega en curso (incremento de software).Una vez creada la prueba unitaria, el desarrollador está mejor capacitado para centrarse en lo que debe implementarse para pasar la prueba. No se agrega nada extraño (MS). Una vez que el código está terminado, se le aplica de inmediato una prueba unitaria, con lo que se obtiene retroalimentación instantánea para los desarrolladores</w:t>
+        <w:t>: Después de que las historias han sido desarrolladas y de que se ha hecho el trabajo de diseño preliminar, el equipo no inicia la codificación, sino que desarrolla una serie de pruebas unitarias a cada una de las historias que se van a incluir en la entrega en curso (incremento de software</w:t>
+      </w:r>
+      <w:proofErr w:type="gramStart"/>
+      <w:r>
+        <w:t>).Una</w:t>
+      </w:r>
+      <w:proofErr w:type="gramEnd"/>
+      <w:r>
+        <w:t xml:space="preserve"> vez creada la prueba unitaria, el desarrollador está mejor capacitado para centrarse en lo que debe implementarse para pasar la prueba. No se agrega nada extraño (MS). Una vez que el código está terminado, se le aplica de inmediato una prueba unitaria, con lo que se obtiene retroalimentación instantánea para los desarrolladores</w:t>
       </w:r>
       <w:r>
         <w:t>.</w:t>
@@ -10144,6 +10187,15 @@
         <w:t>-Altura</w:t>
       </w:r>
     </w:p>
+    <w:p>
+      <w:pPr>
+        <w:pStyle w:val="Ttulo2"/>
+      </w:pPr>
+      <w:r>
+        <w:t>Propuesta del Sistema</w:t>
+      </w:r>
+    </w:p>
+    <w:p/>
     <w:bookmarkEnd w:id="53"/>
     <w:p/>
     <w:p/>
@@ -10166,7 +10218,6 @@
       </w:pPr>
       <w:bookmarkStart w:id="58" w:name="_Toc193705044"/>
       <w:r>
-        <w:lastRenderedPageBreak/>
         <w:t>Actores del Sistema</w:t>
       </w:r>
       <w:bookmarkEnd w:id="58"/>
@@ -10435,7 +10486,16 @@
         <w:t xml:space="preserve"> </w:t>
       </w:r>
       <w:r>
-        <w:t>, estos requerimientos se van a describir por medio de Historias de Usuarios(HU)</w:t>
+        <w:t xml:space="preserve">, estos requerimientos se van a describir por medio de </w:t>
+      </w:r>
+      <w:r>
+        <w:rPr>
+          <w:u w:val="single"/>
+        </w:rPr>
+        <w:t>Historias</w:t>
+      </w:r>
+      <w:r>
+        <w:t xml:space="preserve"> de Usuarios(HU)</w:t>
       </w:r>
       <w:r>
         <w:t>.</w:t>
@@ -10452,11 +10512,9 @@
       <w:r>
         <w:t xml:space="preserve">HU_1: </w:t>
       </w:r>
-      <w:proofErr w:type="spellStart"/>
-      <w:r>
-        <w:t>Login</w:t>
-      </w:r>
-      <w:proofErr w:type="spellEnd"/>
+      <w:r>
+        <w:t>Autenticarse</w:t>
+      </w:r>
       <w:r>
         <w:t>.</w:t>
       </w:r>
@@ -10749,7 +10807,6 @@
           <w:bCs/>
           <w:sz w:val="24"/>
         </w:rPr>
-        <w:lastRenderedPageBreak/>
         <w:t>Rendimiento</w:t>
       </w:r>
       <w:r>
@@ -11048,6 +11105,8 @@
       <w:pPr>
         <w:pStyle w:val="Textoindependiente1"/>
         <w:rPr>
+          <w:b/>
+          <w:bCs/>
           <w:sz w:val="24"/>
         </w:rPr>
       </w:pPr>
@@ -11055,7 +11114,15 @@
         <w:rPr>
           <w:sz w:val="24"/>
         </w:rPr>
-        <w:t xml:space="preserve"> Mantenibilidad</w:t>
+        <w:t xml:space="preserve"> </w:t>
+      </w:r>
+      <w:r>
+        <w:rPr>
+          <w:b/>
+          <w:bCs/>
+          <w:sz w:val="24"/>
+        </w:rPr>
+        <w:t>Mantenibilidad</w:t>
       </w:r>
     </w:p>
     <w:p>
@@ -11096,13 +11163,1124 @@
     </w:p>
     <w:p>
       <w:pPr>
+        <w:spacing w:before="100" w:beforeAutospacing="1" w:after="100" w:afterAutospacing="1" w:line="240" w:lineRule="auto"/>
+        <w:rPr>
+          <w:b/>
+          <w:bCs/>
+        </w:rPr>
+      </w:pPr>
+      <w:r>
+        <w:rPr>
+          <w:b/>
+          <w:bCs/>
+        </w:rPr>
+        <w:t>Software</w:t>
+      </w:r>
+    </w:p>
+    <w:p>
+      <w:pPr>
+        <w:spacing w:before="100" w:beforeAutospacing="1" w:after="100" w:afterAutospacing="1" w:line="240" w:lineRule="auto"/>
+        <w:rPr>
+          <w:b/>
+          <w:bCs/>
+        </w:rPr>
+      </w:pPr>
+      <w:r>
+        <w:rPr>
+          <w:b/>
+          <w:bCs/>
+        </w:rPr>
+        <w:lastRenderedPageBreak/>
+        <w:t>Hardware</w:t>
+      </w:r>
+    </w:p>
+    <w:p>
+      <w:pPr>
         <w:pStyle w:val="Ttulo2"/>
       </w:pPr>
-      <w:bookmarkStart w:id="75" w:name="_Toc193705053"/>
+      <w:bookmarkStart w:id="75" w:name="_Toc193705054"/>
+      <w:r>
+        <w:t>Historias de Usuarios:</w:t>
+      </w:r>
+      <w:bookmarkEnd w:id="75"/>
+    </w:p>
+    <w:p>
+      <w:pPr>
+        <w:rPr>
+          <w:lang w:val="es-CU"/>
+        </w:rPr>
+      </w:pPr>
+      <w:r>
+        <w:t xml:space="preserve">Las Historias de Usuario </w:t>
+      </w:r>
+      <w:r>
+        <w:rPr>
+          <w:lang w:val="es-CU"/>
+        </w:rPr>
+        <w:t xml:space="preserve">representan una breve descripción del comportamiento del sistema, emplea terminología del cliente sin lenguaje técnico, se realiza una por cada característica principal del sistema, se emplean para hacer estimaciones de tiempo y para el plan de lanzamientos, reemplazan un gran documento de requisitos y </w:t>
+      </w:r>
+      <w:r>
+        <w:rPr>
+          <w:lang w:val="es-ES_tradnl"/>
+        </w:rPr>
+        <w:t>preceden</w:t>
+      </w:r>
+      <w:r>
+        <w:rPr>
+          <w:lang w:val="es-CU"/>
+        </w:rPr>
+        <w:t xml:space="preserve"> la creación de las pruebas de aceptación</w:t>
+      </w:r>
+    </w:p>
+    <w:tbl>
+      <w:tblPr>
+        <w:tblStyle w:val="Tablaconcuadrcula"/>
+        <w:tblpPr w:leftFromText="141" w:rightFromText="141" w:vertAnchor="text" w:horzAnchor="margin" w:tblpY="61"/>
+        <w:tblW w:w="9918" w:type="dxa"/>
+        <w:tblLook w:val="04A0" w:firstRow="1" w:lastRow="0" w:firstColumn="1" w:lastColumn="0" w:noHBand="0" w:noVBand="1"/>
+      </w:tblPr>
+      <w:tblGrid>
+        <w:gridCol w:w="279"/>
+        <w:gridCol w:w="2268"/>
+        <w:gridCol w:w="1817"/>
+        <w:gridCol w:w="5554"/>
+      </w:tblGrid>
+      <w:tr>
+        <w:tc>
+          <w:tcPr>
+            <w:tcW w:w="279" w:type="dxa"/>
+          </w:tcPr>
+          <w:p/>
+        </w:tc>
+        <w:tc>
+          <w:tcPr>
+            <w:tcW w:w="9639" w:type="dxa"/>
+            <w:gridSpan w:val="3"/>
+          </w:tcPr>
+          <w:p>
+            <w:r>
+              <w:t>Historia de Usuario</w:t>
+            </w:r>
+          </w:p>
+        </w:tc>
+      </w:tr>
+      <w:tr>
+        <w:tc>
+          <w:tcPr>
+            <w:tcW w:w="2547" w:type="dxa"/>
+            <w:gridSpan w:val="2"/>
+          </w:tcPr>
+          <w:p>
+            <w:pPr>
+              <w:rPr>
+                <w:b/>
+              </w:rPr>
+            </w:pPr>
+            <w:r>
+              <w:t>Número: 1</w:t>
+            </w:r>
+          </w:p>
+        </w:tc>
+        <w:tc>
+          <w:tcPr>
+            <w:tcW w:w="7371" w:type="dxa"/>
+            <w:gridSpan w:val="2"/>
+          </w:tcPr>
+          <w:p>
+            <w:r>
+              <w:t xml:space="preserve">Nombre de la Historia de Usuario: </w:t>
+            </w:r>
+            <w:r>
+              <w:t>Autenticarse</w:t>
+            </w:r>
+          </w:p>
+          <w:p/>
+        </w:tc>
+      </w:tr>
+      <w:tr>
+        <w:tc>
+          <w:tcPr>
+            <w:tcW w:w="279" w:type="dxa"/>
+          </w:tcPr>
+          <w:p/>
+        </w:tc>
+        <w:tc>
+          <w:tcPr>
+            <w:tcW w:w="9639" w:type="dxa"/>
+            <w:gridSpan w:val="3"/>
+          </w:tcPr>
+          <w:p>
+            <w:r>
+              <w:t>Modificación o Extensión de Historia de Usuario y Número: Ninguna</w:t>
+            </w:r>
+          </w:p>
+        </w:tc>
+      </w:tr>
+      <w:tr>
+        <w:tc>
+          <w:tcPr>
+            <w:tcW w:w="4364" w:type="dxa"/>
+            <w:gridSpan w:val="3"/>
+          </w:tcPr>
+          <w:p>
+            <w:pPr>
+              <w:rPr>
+                <w:b/>
+              </w:rPr>
+            </w:pPr>
+            <w:r>
+              <w:t>Usuario: Administrador y Cliente</w:t>
+            </w:r>
+          </w:p>
+          <w:p/>
+        </w:tc>
+        <w:tc>
+          <w:tcPr>
+            <w:tcW w:w="5554" w:type="dxa"/>
+          </w:tcPr>
+          <w:p>
+            <w:r>
+              <w:t xml:space="preserve">Iteración asignada: </w:t>
+            </w:r>
+          </w:p>
+          <w:p/>
+        </w:tc>
+      </w:tr>
+      <w:tr>
+        <w:tc>
+          <w:tcPr>
+            <w:tcW w:w="4364" w:type="dxa"/>
+            <w:gridSpan w:val="3"/>
+          </w:tcPr>
+          <w:p>
+            <w:r>
+              <w:t>Prioridad del Negocio: (Alta/Media/ Baja)</w:t>
+            </w:r>
+          </w:p>
+          <w:p>
+            <w:pPr>
+              <w:rPr>
+                <w:b/>
+              </w:rPr>
+            </w:pPr>
+            <w:r>
+              <w:t>Alta</w:t>
+            </w:r>
+          </w:p>
+        </w:tc>
+        <w:tc>
+          <w:tcPr>
+            <w:tcW w:w="5554" w:type="dxa"/>
+          </w:tcPr>
+          <w:p>
+            <w:r>
+              <w:t>Puntos Estimados: 1 semana</w:t>
+            </w:r>
+          </w:p>
+          <w:p/>
+        </w:tc>
+      </w:tr>
+      <w:tr>
+        <w:tc>
+          <w:tcPr>
+            <w:tcW w:w="4364" w:type="dxa"/>
+            <w:gridSpan w:val="3"/>
+          </w:tcPr>
+          <w:p>
+            <w:r>
+              <w:t>Riesgo en Desarrollo:(Alta/Media/ Baja)</w:t>
+            </w:r>
+          </w:p>
+          <w:p>
+            <w:pPr>
+              <w:rPr>
+                <w:b/>
+              </w:rPr>
+            </w:pPr>
+            <w:r>
+              <w:t>Baja</w:t>
+            </w:r>
+          </w:p>
+        </w:tc>
+        <w:tc>
+          <w:tcPr>
+            <w:tcW w:w="5554" w:type="dxa"/>
+          </w:tcPr>
+          <w:p>
+            <w:r>
+              <w:t xml:space="preserve">Puntos Reales: </w:t>
+            </w:r>
+          </w:p>
+          <w:p/>
+        </w:tc>
+      </w:tr>
+      <w:tr>
+        <w:tc>
+          <w:tcPr>
+            <w:tcW w:w="279" w:type="dxa"/>
+          </w:tcPr>
+          <w:p/>
+        </w:tc>
+        <w:tc>
+          <w:tcPr>
+            <w:tcW w:w="9639" w:type="dxa"/>
+            <w:gridSpan w:val="3"/>
+          </w:tcPr>
+          <w:p>
+            <w:r>
+              <w:t>Programador responsable: Dariel Cabrera</w:t>
+            </w:r>
+          </w:p>
+        </w:tc>
+      </w:tr>
+      <w:tr>
+        <w:tc>
+          <w:tcPr>
+            <w:tcW w:w="279" w:type="dxa"/>
+          </w:tcPr>
+          <w:p/>
+        </w:tc>
+        <w:tc>
+          <w:tcPr>
+            <w:tcW w:w="9639" w:type="dxa"/>
+            <w:gridSpan w:val="3"/>
+          </w:tcPr>
+          <w:p>
+            <w:r>
+              <w:rPr>
+                <w:b/>
+              </w:rPr>
+              <w:t xml:space="preserve">Descripción: </w:t>
+            </w:r>
+            <w:r>
+              <w:t xml:space="preserve">El módulo de autenticación debe mostrar un formulario que está compuesto por dos campos obligatorios, usuario y contraseña.  Cuando el usuario se autentique hará el rol de administrador o de </w:t>
+            </w:r>
+            <w:r>
+              <w:t>trabajador</w:t>
+            </w:r>
+            <w:r>
+              <w:t>.</w:t>
+            </w:r>
+          </w:p>
+        </w:tc>
+      </w:tr>
+      <w:tr>
+        <w:tc>
+          <w:tcPr>
+            <w:tcW w:w="279" w:type="dxa"/>
+          </w:tcPr>
+          <w:p/>
+        </w:tc>
+        <w:tc>
+          <w:tcPr>
+            <w:tcW w:w="9639" w:type="dxa"/>
+            <w:gridSpan w:val="3"/>
+          </w:tcPr>
+          <w:p>
+            <w:r>
+              <w:rPr>
+                <w:b/>
+              </w:rPr>
+              <w:t xml:space="preserve">Observaciones: </w:t>
+            </w:r>
+            <w:r>
+              <w:t>En caso que los datos de entradas no estén correctos, se lanza un mensaje alertando que las credenciales son incorrectas.</w:t>
+            </w:r>
+          </w:p>
+          <w:p/>
+        </w:tc>
+      </w:tr>
+      <w:tr>
+        <w:tc>
+          <w:tcPr>
+            <w:tcW w:w="279" w:type="dxa"/>
+          </w:tcPr>
+          <w:p/>
+        </w:tc>
+        <w:tc>
+          <w:tcPr>
+            <w:tcW w:w="9639" w:type="dxa"/>
+            <w:gridSpan w:val="3"/>
+          </w:tcPr>
+          <w:p>
+            <w:pPr>
+              <w:rPr>
+                <w:b/>
+                <w:bCs/>
+                <w:color w:val="auto"/>
+                <w:sz w:val="22"/>
+                <w:szCs w:val="22"/>
+              </w:rPr>
+            </w:pPr>
+            <w:r>
+              <w:t xml:space="preserve">                     </w:t>
+            </w:r>
+            <w:r>
+              <w:rPr>
+                <w:noProof/>
+              </w:rPr>
+              <w:drawing>
+                <wp:inline distT="0" distB="0" distL="0" distR="0" wp14:anchorId="31D56FC0" wp14:editId="642CE7F3">
+                  <wp:extent cx="3986366" cy="2753833"/>
+                  <wp:effectExtent l="0" t="0" r="0" b="8890"/>
+                  <wp:docPr id="5" name="Imagen 5"/>
+                  <wp:cNvGraphicFramePr>
+                    <a:graphicFrameLocks xmlns:a="http://schemas.openxmlformats.org/drawingml/2006/main" noChangeAspect="1"/>
+                  </wp:cNvGraphicFramePr>
+                  <a:graphic xmlns:a="http://schemas.openxmlformats.org/drawingml/2006/main">
+                    <a:graphicData uri="http://schemas.openxmlformats.org/drawingml/2006/picture">
+                      <pic:pic xmlns:pic="http://schemas.openxmlformats.org/drawingml/2006/picture">
+                        <pic:nvPicPr>
+                          <pic:cNvPr id="0" name="Picture 2"/>
+                          <pic:cNvPicPr>
+                            <a:picLocks noChangeAspect="1" noChangeArrowheads="1"/>
+                          </pic:cNvPicPr>
+                        </pic:nvPicPr>
+                        <pic:blipFill>
+                          <a:blip r:embed="rId32">
+                            <a:extLst>
+                              <a:ext uri="{28A0092B-C50C-407E-A947-70E740481C1C}">
+                                <a14:useLocalDpi xmlns:a14="http://schemas.microsoft.com/office/drawing/2010/main" val="0"/>
+                              </a:ext>
+                            </a:extLst>
+                          </a:blip>
+                          <a:srcRect/>
+                          <a:stretch>
+                            <a:fillRect/>
+                          </a:stretch>
+                        </pic:blipFill>
+                        <pic:spPr bwMode="auto">
+                          <a:xfrm>
+                            <a:off x="0" y="0"/>
+                            <a:ext cx="4035312" cy="2787646"/>
+                          </a:xfrm>
+                          <a:prstGeom prst="rect">
+                            <a:avLst/>
+                          </a:prstGeom>
+                          <a:noFill/>
+                          <a:ln>
+                            <a:noFill/>
+                          </a:ln>
+                        </pic:spPr>
+                      </pic:pic>
+                    </a:graphicData>
+                  </a:graphic>
+                </wp:inline>
+              </w:drawing>
+            </w:r>
+          </w:p>
+        </w:tc>
+      </w:tr>
+    </w:tbl>
+    <w:tbl>
+      <w:tblPr>
+        <w:tblStyle w:val="Tablaconcuadrcula"/>
+        <w:tblpPr w:leftFromText="141" w:rightFromText="141" w:vertAnchor="text" w:horzAnchor="margin" w:tblpY="-595"/>
+        <w:tblW w:w="9918" w:type="dxa"/>
+        <w:tblLook w:val="04A0" w:firstRow="1" w:lastRow="0" w:firstColumn="1" w:lastColumn="0" w:noHBand="0" w:noVBand="1"/>
+      </w:tblPr>
+      <w:tblGrid>
+        <w:gridCol w:w="279"/>
+        <w:gridCol w:w="2268"/>
+        <w:gridCol w:w="1817"/>
+        <w:gridCol w:w="5554"/>
+      </w:tblGrid>
+      <w:tr>
+        <w:tc>
+          <w:tcPr>
+            <w:tcW w:w="279" w:type="dxa"/>
+          </w:tcPr>
+          <w:p/>
+        </w:tc>
+        <w:tc>
+          <w:tcPr>
+            <w:tcW w:w="9639" w:type="dxa"/>
+            <w:gridSpan w:val="3"/>
+          </w:tcPr>
+          <w:p>
+            <w:r>
+              <w:t>Historia de Usuario</w:t>
+            </w:r>
+          </w:p>
+        </w:tc>
+      </w:tr>
+      <w:tr>
+        <w:tc>
+          <w:tcPr>
+            <w:tcW w:w="2547" w:type="dxa"/>
+            <w:gridSpan w:val="2"/>
+          </w:tcPr>
+          <w:p>
+            <w:pPr>
+              <w:rPr>
+                <w:b/>
+              </w:rPr>
+            </w:pPr>
+            <w:r>
+              <w:t xml:space="preserve">Número: </w:t>
+            </w:r>
+            <w:r>
+              <w:t>2</w:t>
+            </w:r>
+          </w:p>
+        </w:tc>
+        <w:tc>
+          <w:tcPr>
+            <w:tcW w:w="7371" w:type="dxa"/>
+            <w:gridSpan w:val="2"/>
+          </w:tcPr>
+          <w:p>
+            <w:r>
+              <w:t xml:space="preserve">Nombre de la Historia de Usuario: </w:t>
+            </w:r>
+            <w:r>
+              <w:t>Inicio</w:t>
+            </w:r>
+          </w:p>
+          <w:p/>
+        </w:tc>
+      </w:tr>
+      <w:tr>
+        <w:tc>
+          <w:tcPr>
+            <w:tcW w:w="279" w:type="dxa"/>
+          </w:tcPr>
+          <w:p/>
+        </w:tc>
+        <w:tc>
+          <w:tcPr>
+            <w:tcW w:w="9639" w:type="dxa"/>
+            <w:gridSpan w:val="3"/>
+          </w:tcPr>
+          <w:p>
+            <w:r>
+              <w:t>Modificación o Extensión de Historia de Usuario y Número: Ninguna</w:t>
+            </w:r>
+          </w:p>
+        </w:tc>
+      </w:tr>
+      <w:tr>
+        <w:tc>
+          <w:tcPr>
+            <w:tcW w:w="4364" w:type="dxa"/>
+            <w:gridSpan w:val="3"/>
+          </w:tcPr>
+          <w:p>
+            <w:pPr>
+              <w:rPr>
+                <w:b/>
+              </w:rPr>
+            </w:pPr>
+            <w:r>
+              <w:t xml:space="preserve">Usuario: </w:t>
+            </w:r>
+            <w:r>
+              <w:t>Administrador y Clientes</w:t>
+            </w:r>
+          </w:p>
+          <w:p/>
+        </w:tc>
+        <w:tc>
+          <w:tcPr>
+            <w:tcW w:w="5554" w:type="dxa"/>
+          </w:tcPr>
+          <w:p>
+            <w:r>
+              <w:t xml:space="preserve">Iteración asignada: </w:t>
+            </w:r>
+          </w:p>
+          <w:p/>
+        </w:tc>
+      </w:tr>
+      <w:tr>
+        <w:tc>
+          <w:tcPr>
+            <w:tcW w:w="4364" w:type="dxa"/>
+            <w:gridSpan w:val="3"/>
+          </w:tcPr>
+          <w:p>
+            <w:r>
+              <w:t>Prioridad del Negocio: (Alta/Media/ Baja)</w:t>
+            </w:r>
+          </w:p>
+          <w:p>
+            <w:pPr>
+              <w:rPr>
+                <w:b/>
+              </w:rPr>
+            </w:pPr>
+            <w:r>
+              <w:t>Media</w:t>
+            </w:r>
+          </w:p>
+        </w:tc>
+        <w:tc>
+          <w:tcPr>
+            <w:tcW w:w="5554" w:type="dxa"/>
+          </w:tcPr>
+          <w:p>
+            <w:r>
+              <w:t>Puntos Estimados: 1 semana</w:t>
+            </w:r>
+          </w:p>
+          <w:p/>
+        </w:tc>
+      </w:tr>
+      <w:tr>
+        <w:tc>
+          <w:tcPr>
+            <w:tcW w:w="4364" w:type="dxa"/>
+            <w:gridSpan w:val="3"/>
+          </w:tcPr>
+          <w:p>
+            <w:r>
+              <w:t>Riesgo en Desarrollo</w:t>
+            </w:r>
+            <w:proofErr w:type="gramStart"/>
+            <w:r>
+              <w:t>:  (</w:t>
+            </w:r>
+            <w:proofErr w:type="gramEnd"/>
+            <w:r>
+              <w:t>Alta/Media/ Baja)</w:t>
+            </w:r>
+          </w:p>
+          <w:p>
+            <w:pPr>
+              <w:rPr>
+                <w:b/>
+              </w:rPr>
+            </w:pPr>
+            <w:r>
+              <w:t>Baja</w:t>
+            </w:r>
+          </w:p>
+        </w:tc>
+        <w:tc>
+          <w:tcPr>
+            <w:tcW w:w="5554" w:type="dxa"/>
+          </w:tcPr>
+          <w:p>
+            <w:r>
+              <w:t xml:space="preserve">Puntos Reales: </w:t>
+            </w:r>
+          </w:p>
+          <w:p/>
+        </w:tc>
+      </w:tr>
+      <w:tr>
+        <w:tc>
+          <w:tcPr>
+            <w:tcW w:w="279" w:type="dxa"/>
+          </w:tcPr>
+          <w:p/>
+        </w:tc>
+        <w:tc>
+          <w:tcPr>
+            <w:tcW w:w="9639" w:type="dxa"/>
+            <w:gridSpan w:val="3"/>
+          </w:tcPr>
+          <w:p>
+            <w:r>
+              <w:t>Programador responsable: Dariel Cabrera</w:t>
+            </w:r>
+          </w:p>
+        </w:tc>
+      </w:tr>
+      <w:tr>
+        <w:tc>
+          <w:tcPr>
+            <w:tcW w:w="279" w:type="dxa"/>
+          </w:tcPr>
+          <w:p/>
+        </w:tc>
+        <w:tc>
+          <w:tcPr>
+            <w:tcW w:w="9639" w:type="dxa"/>
+            <w:gridSpan w:val="3"/>
+          </w:tcPr>
+          <w:p>
+            <w:r>
+              <w:rPr>
+                <w:b/>
+              </w:rPr>
+              <w:t xml:space="preserve">Descripción: </w:t>
+            </w:r>
+            <w:r>
+              <w:t>El usuario tendrá visibilidad a las informaciones generales de la página, además de que tendrá</w:t>
+            </w:r>
+            <w:r>
+              <w:rPr>
+                <w:b/>
+              </w:rPr>
+              <w:t xml:space="preserve"> </w:t>
+            </w:r>
+            <w:r>
+              <w:t>las opciones para acceder a las diferentes secciones de la página.</w:t>
+            </w:r>
+          </w:p>
+        </w:tc>
+      </w:tr>
+      <w:tr>
+        <w:tc>
+          <w:tcPr>
+            <w:tcW w:w="279" w:type="dxa"/>
+          </w:tcPr>
+          <w:p/>
+        </w:tc>
+        <w:tc>
+          <w:tcPr>
+            <w:tcW w:w="9639" w:type="dxa"/>
+            <w:gridSpan w:val="3"/>
+          </w:tcPr>
+          <w:p>
+            <w:r>
+              <w:t xml:space="preserve">Observaciones: </w:t>
+            </w:r>
+          </w:p>
+        </w:tc>
+      </w:tr>
+      <w:tr>
+        <w:tc>
+          <w:tcPr>
+            <w:tcW w:w="279" w:type="dxa"/>
+          </w:tcPr>
+          <w:p/>
+        </w:tc>
+        <w:tc>
+          <w:tcPr>
+            <w:tcW w:w="9639" w:type="dxa"/>
+            <w:gridSpan w:val="3"/>
+          </w:tcPr>
+          <w:p>
+            <w:r>
+              <w:t xml:space="preserve">                              </w:t>
+            </w:r>
+            <w:r>
+              <w:rPr>
+                <w:noProof/>
+              </w:rPr>
+              <w:drawing>
+                <wp:inline distT="0" distB="0" distL="0" distR="0" wp14:anchorId="6BE872C4" wp14:editId="4F87BFBD">
+                  <wp:extent cx="3422650" cy="2594344"/>
+                  <wp:effectExtent l="0" t="0" r="6350" b="0"/>
+                  <wp:docPr id="1" name="Imagen 1"/>
+                  <wp:cNvGraphicFramePr>
+                    <a:graphicFrameLocks xmlns:a="http://schemas.openxmlformats.org/drawingml/2006/main" noChangeAspect="1"/>
+                  </wp:cNvGraphicFramePr>
+                  <a:graphic xmlns:a="http://schemas.openxmlformats.org/drawingml/2006/main">
+                    <a:graphicData uri="http://schemas.openxmlformats.org/drawingml/2006/picture">
+                      <pic:pic xmlns:pic="http://schemas.openxmlformats.org/drawingml/2006/picture">
+                        <pic:nvPicPr>
+                          <pic:cNvPr id="0" name="Picture 10"/>
+                          <pic:cNvPicPr>
+                            <a:picLocks noChangeAspect="1" noChangeArrowheads="1"/>
+                          </pic:cNvPicPr>
+                        </pic:nvPicPr>
+                        <pic:blipFill>
+                          <a:blip r:embed="rId33">
+                            <a:extLst>
+                              <a:ext uri="{28A0092B-C50C-407E-A947-70E740481C1C}">
+                                <a14:useLocalDpi xmlns:a14="http://schemas.microsoft.com/office/drawing/2010/main" val="0"/>
+                              </a:ext>
+                            </a:extLst>
+                          </a:blip>
+                          <a:srcRect/>
+                          <a:stretch>
+                            <a:fillRect/>
+                          </a:stretch>
+                        </pic:blipFill>
+                        <pic:spPr bwMode="auto">
+                          <a:xfrm>
+                            <a:off x="0" y="0"/>
+                            <a:ext cx="3490878" cy="2646060"/>
+                          </a:xfrm>
+                          <a:prstGeom prst="rect">
+                            <a:avLst/>
+                          </a:prstGeom>
+                          <a:noFill/>
+                          <a:ln>
+                            <a:noFill/>
+                          </a:ln>
+                        </pic:spPr>
+                      </pic:pic>
+                    </a:graphicData>
+                  </a:graphic>
+                </wp:inline>
+              </w:drawing>
+            </w:r>
+            <w:r>
+              <w:t xml:space="preserve">       </w:t>
+            </w:r>
+          </w:p>
+        </w:tc>
+      </w:tr>
+    </w:tbl>
+    <w:p>
+      <w:pPr>
+        <w:rPr>
+          <w:lang w:val="es-CU"/>
+        </w:rPr>
+      </w:pPr>
+    </w:p>
+    <w:p>
+      <w:pPr>
+        <w:jc w:val="left"/>
+        <w:rPr>
+          <w:lang w:val="es-CU"/>
+        </w:rPr>
+      </w:pPr>
+    </w:p>
+    <w:tbl>
+      <w:tblPr>
+        <w:tblStyle w:val="Tablaconcuadrcula"/>
+        <w:tblW w:w="9918" w:type="dxa"/>
+        <w:tblLook w:val="04A0" w:firstRow="1" w:lastRow="0" w:firstColumn="1" w:lastColumn="0" w:noHBand="0" w:noVBand="1"/>
+      </w:tblPr>
+      <w:tblGrid>
+        <w:gridCol w:w="279"/>
+        <w:gridCol w:w="2268"/>
+        <w:gridCol w:w="1817"/>
+        <w:gridCol w:w="5554"/>
+      </w:tblGrid>
+      <w:tr>
+        <w:tc>
+          <w:tcPr>
+            <w:tcW w:w="279" w:type="dxa"/>
+          </w:tcPr>
+          <w:p/>
+        </w:tc>
+        <w:tc>
+          <w:tcPr>
+            <w:tcW w:w="9639" w:type="dxa"/>
+            <w:gridSpan w:val="3"/>
+          </w:tcPr>
+          <w:p>
+            <w:r>
+              <w:t>Historia de Usuario</w:t>
+            </w:r>
+          </w:p>
+        </w:tc>
+      </w:tr>
+      <w:tr>
+        <w:tc>
+          <w:tcPr>
+            <w:tcW w:w="2547" w:type="dxa"/>
+            <w:gridSpan w:val="2"/>
+          </w:tcPr>
+          <w:p>
+            <w:pPr>
+              <w:rPr>
+                <w:b/>
+              </w:rPr>
+            </w:pPr>
+            <w:r>
+              <w:t xml:space="preserve">Número: </w:t>
+            </w:r>
+            <w:r>
+              <w:t>3</w:t>
+            </w:r>
+          </w:p>
+        </w:tc>
+        <w:tc>
+          <w:tcPr>
+            <w:tcW w:w="7371" w:type="dxa"/>
+            <w:gridSpan w:val="2"/>
+          </w:tcPr>
+          <w:p>
+            <w:r>
+              <w:t xml:space="preserve">Nombre de la Historia de Usuario: </w:t>
+            </w:r>
+            <w:r>
+              <w:t>Cálculo</w:t>
+            </w:r>
+          </w:p>
+          <w:p/>
+        </w:tc>
+      </w:tr>
+      <w:tr>
+        <w:tc>
+          <w:tcPr>
+            <w:tcW w:w="279" w:type="dxa"/>
+          </w:tcPr>
+          <w:p/>
+        </w:tc>
+        <w:tc>
+          <w:tcPr>
+            <w:tcW w:w="9639" w:type="dxa"/>
+            <w:gridSpan w:val="3"/>
+          </w:tcPr>
+          <w:p>
+            <w:r>
+              <w:t>Modificación o Extensión de Historia de Usuario y Número: Ninguna</w:t>
+            </w:r>
+          </w:p>
+        </w:tc>
+      </w:tr>
+      <w:tr>
+        <w:tc>
+          <w:tcPr>
+            <w:tcW w:w="4364" w:type="dxa"/>
+            <w:gridSpan w:val="3"/>
+          </w:tcPr>
+          <w:p>
+            <w:pPr>
+              <w:rPr>
+                <w:b/>
+              </w:rPr>
+            </w:pPr>
+            <w:r>
+              <w:t xml:space="preserve">Usuario: </w:t>
+            </w:r>
+            <w:r>
+              <w:t>Administrador y Clientes</w:t>
+            </w:r>
+          </w:p>
+          <w:p/>
+        </w:tc>
+        <w:tc>
+          <w:tcPr>
+            <w:tcW w:w="5554" w:type="dxa"/>
+          </w:tcPr>
+          <w:p>
+            <w:r>
+              <w:t xml:space="preserve">Iteración asignada: </w:t>
+            </w:r>
+          </w:p>
+          <w:p/>
+        </w:tc>
+      </w:tr>
+      <w:tr>
+        <w:tc>
+          <w:tcPr>
+            <w:tcW w:w="4364" w:type="dxa"/>
+            <w:gridSpan w:val="3"/>
+          </w:tcPr>
+          <w:p>
+            <w:r>
+              <w:t>Prioridad del Negocio: (Alta/Media/ Baja)</w:t>
+            </w:r>
+          </w:p>
+          <w:p>
+            <w:pPr>
+              <w:rPr>
+                <w:b/>
+              </w:rPr>
+            </w:pPr>
+            <w:r>
+              <w:t>Alta</w:t>
+            </w:r>
+          </w:p>
+        </w:tc>
+        <w:tc>
+          <w:tcPr>
+            <w:tcW w:w="5554" w:type="dxa"/>
+          </w:tcPr>
+          <w:p>
+            <w:r>
+              <w:t>Puntos Estimados: 1 semana</w:t>
+            </w:r>
+          </w:p>
+          <w:p/>
+        </w:tc>
+      </w:tr>
+      <w:tr>
+        <w:tc>
+          <w:tcPr>
+            <w:tcW w:w="4364" w:type="dxa"/>
+            <w:gridSpan w:val="3"/>
+          </w:tcPr>
+          <w:p>
+            <w:r>
+              <w:t>Riesgo en Desarrollo: (Alta/Media/ Baja)</w:t>
+            </w:r>
+          </w:p>
+          <w:p>
+            <w:pPr>
+              <w:rPr>
+                <w:b/>
+              </w:rPr>
+            </w:pPr>
+            <w:r>
+              <w:t>Baja</w:t>
+            </w:r>
+          </w:p>
+        </w:tc>
+        <w:tc>
+          <w:tcPr>
+            <w:tcW w:w="5554" w:type="dxa"/>
+          </w:tcPr>
+          <w:p>
+            <w:r>
+              <w:t xml:space="preserve">Puntos Reales: </w:t>
+            </w:r>
+          </w:p>
+          <w:p/>
+        </w:tc>
+      </w:tr>
+      <w:tr>
+        <w:tc>
+          <w:tcPr>
+            <w:tcW w:w="279" w:type="dxa"/>
+          </w:tcPr>
+          <w:p/>
+        </w:tc>
+        <w:tc>
+          <w:tcPr>
+            <w:tcW w:w="9639" w:type="dxa"/>
+            <w:gridSpan w:val="3"/>
+          </w:tcPr>
+          <w:p>
+            <w:r>
+              <w:t>Programador responsable: Dariel Cabrera</w:t>
+            </w:r>
+          </w:p>
+        </w:tc>
+      </w:tr>
+      <w:tr>
+        <w:tc>
+          <w:tcPr>
+            <w:tcW w:w="279" w:type="dxa"/>
+          </w:tcPr>
+          <w:p/>
+        </w:tc>
+        <w:tc>
+          <w:tcPr>
+            <w:tcW w:w="9639" w:type="dxa"/>
+            <w:gridSpan w:val="3"/>
+          </w:tcPr>
+          <w:p>
+            <w:r>
+              <w:rPr>
+                <w:b/>
+              </w:rPr>
+              <w:t>Descripción:</w:t>
+            </w:r>
+            <w:r>
+              <w:rPr>
+                <w:b/>
+              </w:rPr>
+              <w:t xml:space="preserve"> </w:t>
+            </w:r>
+            <w:r>
+              <w:rPr>
+                <w:bCs/>
+              </w:rPr>
+              <w:t>Tendrá una tabla donde se observe los cálculos realizados además de un botón nuevo y las opciones de editar y eliminar algún calculo</w:t>
+            </w:r>
+          </w:p>
+        </w:tc>
+      </w:tr>
+      <w:tr>
+        <w:tc>
+          <w:tcPr>
+            <w:tcW w:w="279" w:type="dxa"/>
+          </w:tcPr>
+          <w:p/>
+        </w:tc>
+        <w:tc>
+          <w:tcPr>
+            <w:tcW w:w="9639" w:type="dxa"/>
+            <w:gridSpan w:val="3"/>
+          </w:tcPr>
+          <w:p>
+            <w:r>
+              <w:t xml:space="preserve">Observaciones: </w:t>
+            </w:r>
+          </w:p>
+          <w:p>
+            <w:r>
+              <w:t>.</w:t>
+            </w:r>
+          </w:p>
+        </w:tc>
+      </w:tr>
+      <w:tr>
+        <w:tc>
+          <w:tcPr>
+            <w:tcW w:w="279" w:type="dxa"/>
+          </w:tcPr>
+          <w:p/>
+        </w:tc>
+        <w:tc>
+          <w:tcPr>
+            <w:tcW w:w="9639" w:type="dxa"/>
+            <w:gridSpan w:val="3"/>
+          </w:tcPr>
+          <w:p>
+            <w:r>
+              <w:rPr>
+                <w:noProof/>
+              </w:rPr>
+              <w:t xml:space="preserve">                       </w:t>
+            </w:r>
+            <w:r>
+              <w:rPr>
+                <w:noProof/>
+              </w:rPr>
+              <w:drawing>
+                <wp:inline distT="0" distB="0" distL="0" distR="0" wp14:anchorId="742E2B7F" wp14:editId="0EA5EDC1">
+                  <wp:extent cx="3561907" cy="2930300"/>
+                  <wp:effectExtent l="0" t="0" r="635" b="3810"/>
+                  <wp:docPr id="8" name="Imagen 8"/>
+                  <wp:cNvGraphicFramePr>
+                    <a:graphicFrameLocks xmlns:a="http://schemas.openxmlformats.org/drawingml/2006/main" noChangeAspect="1"/>
+                  </wp:cNvGraphicFramePr>
+                  <a:graphic xmlns:a="http://schemas.openxmlformats.org/drawingml/2006/main">
+                    <a:graphicData uri="http://schemas.openxmlformats.org/drawingml/2006/picture">
+                      <pic:pic xmlns:pic="http://schemas.openxmlformats.org/drawingml/2006/picture">
+                        <pic:nvPicPr>
+                          <pic:cNvPr id="0" name="Picture 11"/>
+                          <pic:cNvPicPr>
+                            <a:picLocks noChangeAspect="1" noChangeArrowheads="1"/>
+                          </pic:cNvPicPr>
+                        </pic:nvPicPr>
+                        <pic:blipFill>
+                          <a:blip r:embed="rId34">
+                            <a:extLst>
+                              <a:ext uri="{28A0092B-C50C-407E-A947-70E740481C1C}">
+                                <a14:useLocalDpi xmlns:a14="http://schemas.microsoft.com/office/drawing/2010/main" val="0"/>
+                              </a:ext>
+                            </a:extLst>
+                          </a:blip>
+                          <a:srcRect/>
+                          <a:stretch>
+                            <a:fillRect/>
+                          </a:stretch>
+                        </pic:blipFill>
+                        <pic:spPr bwMode="auto">
+                          <a:xfrm>
+                            <a:off x="0" y="0"/>
+                            <a:ext cx="3611925" cy="2971449"/>
+                          </a:xfrm>
+                          <a:prstGeom prst="rect">
+                            <a:avLst/>
+                          </a:prstGeom>
+                          <a:noFill/>
+                          <a:ln>
+                            <a:noFill/>
+                          </a:ln>
+                        </pic:spPr>
+                      </pic:pic>
+                    </a:graphicData>
+                  </a:graphic>
+                </wp:inline>
+              </w:drawing>
+            </w:r>
+          </w:p>
+        </w:tc>
+      </w:tr>
+    </w:tbl>
+    <w:p/>
+    <w:p>
+      <w:pPr>
+        <w:pStyle w:val="Ttulo2"/>
+      </w:pPr>
+      <w:bookmarkStart w:id="76" w:name="_Toc193705053"/>
       <w:r>
         <w:t>Patrón Arquitectónico Vista-Controlador</w:t>
       </w:r>
-      <w:bookmarkEnd w:id="75"/>
+      <w:bookmarkEnd w:id="76"/>
     </w:p>
     <w:p>
       <w:pPr>
@@ -11143,14 +12321,7 @@
         <w:rPr>
           <w:lang w:val="es-CU" w:eastAsia="es-CU"/>
         </w:rPr>
-        <w:t xml:space="preserve">Representa los datos y la lógica de negocio de la aplicación, gestiona la persistencia de datos y la manipulación de </w:t>
-      </w:r>
-      <w:r>
-        <w:rPr>
-          <w:lang w:val="es-CU" w:eastAsia="es-CU"/>
-        </w:rPr>
-        <w:lastRenderedPageBreak/>
-        <w:t xml:space="preserve">datos, </w:t>
+        <w:t xml:space="preserve">Representa los datos y la lógica de negocio de la aplicación, gestiona la persistencia de datos y la manipulación de datos, </w:t>
       </w:r>
       <w:proofErr w:type="spellStart"/>
       <w:r>
@@ -11206,8 +12377,9 @@
         <w:rPr>
           <w:noProof/>
         </w:rPr>
+        <w:lastRenderedPageBreak/>
         <w:drawing>
-          <wp:inline distT="0" distB="0" distL="0" distR="0" wp14:anchorId="0122087F" wp14:editId="11AC97ED">
+          <wp:inline distT="0" distB="0" distL="0" distR="0" wp14:anchorId="0ADB1735" wp14:editId="1215FDA3">
             <wp:extent cx="5391150" cy="2457450"/>
             <wp:effectExtent l="19050" t="19050" r="19050" b="19050"/>
             <wp:docPr id="49" name="Imagen 49"/>
@@ -11224,7 +12396,7 @@
                     </pic:cNvPicPr>
                   </pic:nvPicPr>
                   <pic:blipFill>
-                    <a:blip r:embed="rId32">
+                    <a:blip r:embed="rId35">
                       <a:extLst>
                         <a:ext uri="{28A0092B-C50C-407E-A947-70E740481C1C}">
                           <a14:useLocalDpi xmlns:a14="http://schemas.microsoft.com/office/drawing/2010/main" val="0"/>
@@ -11276,1064 +12448,6 @@
         <w:t>Figura 2.1 Modelo Vista Controlador</w:t>
       </w:r>
     </w:p>
-    <w:p>
-      <w:pPr>
-        <w:pStyle w:val="Ttulo2"/>
-      </w:pPr>
-      <w:bookmarkStart w:id="76" w:name="_Toc193705054"/>
-      <w:r>
-        <w:t>Historias de Usuarios:</w:t>
-      </w:r>
-      <w:bookmarkEnd w:id="76"/>
-    </w:p>
-    <w:p>
-      <w:pPr>
-        <w:rPr>
-          <w:lang w:val="es-CU"/>
-        </w:rPr>
-      </w:pPr>
-      <w:r>
-        <w:t xml:space="preserve">Las Historias de Usuario </w:t>
-      </w:r>
-      <w:r>
-        <w:rPr>
-          <w:lang w:val="es-CU"/>
-        </w:rPr>
-        <w:t xml:space="preserve">representan una breve descripción del comportamiento del sistema, emplea terminología del cliente sin lenguaje técnico, se realiza una por cada característica principal del sistema, se emplean para hacer estimaciones de tiempo y para el plan de lanzamientos, reemplazan un gran documento de requisitos y </w:t>
-      </w:r>
-      <w:r>
-        <w:rPr>
-          <w:lang w:val="es-ES_tradnl"/>
-        </w:rPr>
-        <w:t>preceden</w:t>
-      </w:r>
-      <w:r>
-        <w:rPr>
-          <w:lang w:val="es-CU"/>
-        </w:rPr>
-        <w:t xml:space="preserve"> la creación de las pruebas de aceptación</w:t>
-      </w:r>
-    </w:p>
-    <w:p>
-      <w:pPr>
-        <w:jc w:val="left"/>
-        <w:rPr>
-          <w:lang w:val="es-CU"/>
-        </w:rPr>
-      </w:pPr>
-      <w:r>
-        <w:rPr>
-          <w:lang w:val="es-CU"/>
-        </w:rPr>
-        <w:br w:type="page"/>
-      </w:r>
-    </w:p>
-    <w:p>
-      <w:pPr>
-        <w:rPr>
-          <w:lang w:val="es-CU"/>
-        </w:rPr>
-      </w:pPr>
-    </w:p>
-    <w:tbl>
-      <w:tblPr>
-        <w:tblStyle w:val="Tablaconcuadrcula"/>
-        <w:tblW w:w="9918" w:type="dxa"/>
-        <w:tblLook w:val="04A0" w:firstRow="1" w:lastRow="0" w:firstColumn="1" w:lastColumn="0" w:noHBand="0" w:noVBand="1"/>
-      </w:tblPr>
-      <w:tblGrid>
-        <w:gridCol w:w="279"/>
-        <w:gridCol w:w="2268"/>
-        <w:gridCol w:w="1817"/>
-        <w:gridCol w:w="5554"/>
-      </w:tblGrid>
-      <w:tr>
-        <w:tc>
-          <w:tcPr>
-            <w:tcW w:w="279" w:type="dxa"/>
-          </w:tcPr>
-          <w:p/>
-        </w:tc>
-        <w:tc>
-          <w:tcPr>
-            <w:tcW w:w="9639" w:type="dxa"/>
-            <w:gridSpan w:val="3"/>
-          </w:tcPr>
-          <w:p>
-            <w:r>
-              <w:t>Historia de Usuario</w:t>
-            </w:r>
-          </w:p>
-        </w:tc>
-      </w:tr>
-      <w:tr>
-        <w:tc>
-          <w:tcPr>
-            <w:tcW w:w="2547" w:type="dxa"/>
-            <w:gridSpan w:val="2"/>
-          </w:tcPr>
-          <w:p>
-            <w:pPr>
-              <w:rPr>
-                <w:b/>
-              </w:rPr>
-            </w:pPr>
-            <w:r>
-              <w:t>Número: 1</w:t>
-            </w:r>
-          </w:p>
-        </w:tc>
-        <w:tc>
-          <w:tcPr>
-            <w:tcW w:w="7371" w:type="dxa"/>
-            <w:gridSpan w:val="2"/>
-          </w:tcPr>
-          <w:p>
-            <w:r>
-              <w:t xml:space="preserve">Nombre de la Historia de Usuario: </w:t>
-            </w:r>
-            <w:r>
-              <w:t>Autenticarse</w:t>
-            </w:r>
-          </w:p>
-          <w:p/>
-        </w:tc>
-      </w:tr>
-      <w:tr>
-        <w:tc>
-          <w:tcPr>
-            <w:tcW w:w="279" w:type="dxa"/>
-          </w:tcPr>
-          <w:p/>
-        </w:tc>
-        <w:tc>
-          <w:tcPr>
-            <w:tcW w:w="9639" w:type="dxa"/>
-            <w:gridSpan w:val="3"/>
-          </w:tcPr>
-          <w:p>
-            <w:r>
-              <w:t>Modificación o Extensión de Historia de Usuario y Número: Ninguna</w:t>
-            </w:r>
-          </w:p>
-        </w:tc>
-      </w:tr>
-      <w:tr>
-        <w:tc>
-          <w:tcPr>
-            <w:tcW w:w="4364" w:type="dxa"/>
-            <w:gridSpan w:val="3"/>
-          </w:tcPr>
-          <w:p>
-            <w:pPr>
-              <w:rPr>
-                <w:b/>
-              </w:rPr>
-            </w:pPr>
-            <w:r>
-              <w:t>Usuario: Administrador y Cliente</w:t>
-            </w:r>
-          </w:p>
-          <w:p/>
-        </w:tc>
-        <w:tc>
-          <w:tcPr>
-            <w:tcW w:w="5554" w:type="dxa"/>
-          </w:tcPr>
-          <w:p>
-            <w:r>
-              <w:t xml:space="preserve">Iteración asignada: </w:t>
-            </w:r>
-          </w:p>
-          <w:p/>
-        </w:tc>
-      </w:tr>
-      <w:tr>
-        <w:tc>
-          <w:tcPr>
-            <w:tcW w:w="4364" w:type="dxa"/>
-            <w:gridSpan w:val="3"/>
-          </w:tcPr>
-          <w:p>
-            <w:r>
-              <w:t>Prioridad del Negocio: (Alta/Media/ Baja)</w:t>
-            </w:r>
-          </w:p>
-          <w:p>
-            <w:pPr>
-              <w:rPr>
-                <w:b/>
-              </w:rPr>
-            </w:pPr>
-            <w:r>
-              <w:t>Alta</w:t>
-            </w:r>
-          </w:p>
-        </w:tc>
-        <w:tc>
-          <w:tcPr>
-            <w:tcW w:w="5554" w:type="dxa"/>
-          </w:tcPr>
-          <w:p>
-            <w:r>
-              <w:t>Puntos Estimados: 1 semana</w:t>
-            </w:r>
-          </w:p>
-          <w:p/>
-        </w:tc>
-      </w:tr>
-      <w:tr>
-        <w:tc>
-          <w:tcPr>
-            <w:tcW w:w="4364" w:type="dxa"/>
-            <w:gridSpan w:val="3"/>
-          </w:tcPr>
-          <w:p>
-            <w:r>
-              <w:t>Riesgo en Desarrollo:(Alta/Media/ Baja)</w:t>
-            </w:r>
-          </w:p>
-          <w:p>
-            <w:pPr>
-              <w:rPr>
-                <w:b/>
-              </w:rPr>
-            </w:pPr>
-            <w:r>
-              <w:t>Baja</w:t>
-            </w:r>
-          </w:p>
-        </w:tc>
-        <w:tc>
-          <w:tcPr>
-            <w:tcW w:w="5554" w:type="dxa"/>
-          </w:tcPr>
-          <w:p>
-            <w:r>
-              <w:t xml:space="preserve">Puntos Reales: </w:t>
-            </w:r>
-          </w:p>
-          <w:p/>
-        </w:tc>
-      </w:tr>
-      <w:tr>
-        <w:tc>
-          <w:tcPr>
-            <w:tcW w:w="279" w:type="dxa"/>
-          </w:tcPr>
-          <w:p/>
-        </w:tc>
-        <w:tc>
-          <w:tcPr>
-            <w:tcW w:w="9639" w:type="dxa"/>
-            <w:gridSpan w:val="3"/>
-          </w:tcPr>
-          <w:p>
-            <w:r>
-              <w:t>Programador responsable: Dariel Cabrera</w:t>
-            </w:r>
-          </w:p>
-        </w:tc>
-      </w:tr>
-      <w:tr>
-        <w:tc>
-          <w:tcPr>
-            <w:tcW w:w="279" w:type="dxa"/>
-          </w:tcPr>
-          <w:p/>
-        </w:tc>
-        <w:tc>
-          <w:tcPr>
-            <w:tcW w:w="9639" w:type="dxa"/>
-            <w:gridSpan w:val="3"/>
-          </w:tcPr>
-          <w:p>
-            <w:r>
-              <w:rPr>
-                <w:b/>
-              </w:rPr>
-              <w:t xml:space="preserve">Descripción: </w:t>
-            </w:r>
-            <w:r>
-              <w:t>El módulo de autenticación debe mostrar un formulario que está compuesto por dos campos obligatorios, usuario y contraseña. . Cuando el usuario se autentique hará el rol de administrador o de cliente.</w:t>
-            </w:r>
-          </w:p>
-        </w:tc>
-      </w:tr>
-      <w:tr>
-        <w:tc>
-          <w:tcPr>
-            <w:tcW w:w="279" w:type="dxa"/>
-          </w:tcPr>
-          <w:p/>
-        </w:tc>
-        <w:tc>
-          <w:tcPr>
-            <w:tcW w:w="9639" w:type="dxa"/>
-            <w:gridSpan w:val="3"/>
-          </w:tcPr>
-          <w:p>
-            <w:r>
-              <w:rPr>
-                <w:b/>
-              </w:rPr>
-              <w:t xml:space="preserve">Observaciones: </w:t>
-            </w:r>
-            <w:r>
-              <w:t>En caso que los datos de entradas no estén correctos, se lanza un mensaje alertando que las credenciales son incorrectas.</w:t>
-            </w:r>
-          </w:p>
-          <w:p/>
-        </w:tc>
-      </w:tr>
-      <w:tr>
-        <w:tc>
-          <w:tcPr>
-            <w:tcW w:w="279" w:type="dxa"/>
-          </w:tcPr>
-          <w:p/>
-        </w:tc>
-        <w:tc>
-          <w:tcPr>
-            <w:tcW w:w="9639" w:type="dxa"/>
-            <w:gridSpan w:val="3"/>
-          </w:tcPr>
-          <w:p>
-            <w:pPr>
-              <w:rPr>
-                <w:b/>
-                <w:bCs/>
-                <w:color w:val="auto"/>
-                <w:sz w:val="22"/>
-                <w:szCs w:val="22"/>
-              </w:rPr>
-            </w:pPr>
-            <w:r>
-              <w:t xml:space="preserve">                     </w:t>
-            </w:r>
-            <w:r>
-              <w:rPr>
-                <w:noProof/>
-              </w:rPr>
-              <w:drawing>
-                <wp:inline distT="0" distB="0" distL="0" distR="0" wp14:anchorId="39843709" wp14:editId="20402592">
-                  <wp:extent cx="3397440" cy="3083560"/>
-                  <wp:effectExtent l="0" t="0" r="0" b="2540"/>
-                  <wp:docPr id="4" name="Imagen 4"/>
-                  <wp:cNvGraphicFramePr>
-                    <a:graphicFrameLocks xmlns:a="http://schemas.openxmlformats.org/drawingml/2006/main" noChangeAspect="1"/>
-                  </wp:cNvGraphicFramePr>
-                  <a:graphic xmlns:a="http://schemas.openxmlformats.org/drawingml/2006/main">
-                    <a:graphicData uri="http://schemas.openxmlformats.org/drawingml/2006/picture">
-                      <pic:pic xmlns:pic="http://schemas.openxmlformats.org/drawingml/2006/picture">
-                        <pic:nvPicPr>
-                          <pic:cNvPr id="0" name="Picture 2"/>
-                          <pic:cNvPicPr>
-                            <a:picLocks noChangeAspect="1" noChangeArrowheads="1"/>
-                          </pic:cNvPicPr>
-                        </pic:nvPicPr>
-                        <pic:blipFill>
-                          <a:blip r:embed="rId33">
-                            <a:extLst>
-                              <a:ext uri="{28A0092B-C50C-407E-A947-70E740481C1C}">
-                                <a14:useLocalDpi xmlns:a14="http://schemas.microsoft.com/office/drawing/2010/main" val="0"/>
-                              </a:ext>
-                            </a:extLst>
-                          </a:blip>
-                          <a:srcRect/>
-                          <a:stretch>
-                            <a:fillRect/>
-                          </a:stretch>
-                        </pic:blipFill>
-                        <pic:spPr bwMode="auto">
-                          <a:xfrm>
-                            <a:off x="0" y="0"/>
-                            <a:ext cx="3448199" cy="3129629"/>
-                          </a:xfrm>
-                          <a:prstGeom prst="rect">
-                            <a:avLst/>
-                          </a:prstGeom>
-                          <a:noFill/>
-                          <a:ln>
-                            <a:noFill/>
-                          </a:ln>
-                        </pic:spPr>
-                      </pic:pic>
-                    </a:graphicData>
-                  </a:graphic>
-                </wp:inline>
-              </w:drawing>
-            </w:r>
-          </w:p>
-        </w:tc>
-      </w:tr>
-    </w:tbl>
-    <w:p/>
-    <w:p/>
-    <w:p/>
-    <w:p/>
-    <w:tbl>
-      <w:tblPr>
-        <w:tblStyle w:val="Tablaconcuadrcula"/>
-        <w:tblW w:w="9918" w:type="dxa"/>
-        <w:tblLook w:val="04A0" w:firstRow="1" w:lastRow="0" w:firstColumn="1" w:lastColumn="0" w:noHBand="0" w:noVBand="1"/>
-      </w:tblPr>
-      <w:tblGrid>
-        <w:gridCol w:w="279"/>
-        <w:gridCol w:w="2268"/>
-        <w:gridCol w:w="1817"/>
-        <w:gridCol w:w="5554"/>
-      </w:tblGrid>
-      <w:tr>
-        <w:tc>
-          <w:tcPr>
-            <w:tcW w:w="279" w:type="dxa"/>
-          </w:tcPr>
-          <w:p/>
-        </w:tc>
-        <w:tc>
-          <w:tcPr>
-            <w:tcW w:w="9639" w:type="dxa"/>
-            <w:gridSpan w:val="3"/>
-          </w:tcPr>
-          <w:p>
-            <w:r>
-              <w:t>Historia de Usuario</w:t>
-            </w:r>
-          </w:p>
-        </w:tc>
-      </w:tr>
-      <w:tr>
-        <w:tc>
-          <w:tcPr>
-            <w:tcW w:w="2547" w:type="dxa"/>
-            <w:gridSpan w:val="2"/>
-          </w:tcPr>
-          <w:p>
-            <w:pPr>
-              <w:rPr>
-                <w:b/>
-              </w:rPr>
-            </w:pPr>
-            <w:r>
-              <w:t xml:space="preserve">Número: </w:t>
-            </w:r>
-            <w:r>
-              <w:t>2</w:t>
-            </w:r>
-          </w:p>
-        </w:tc>
-        <w:tc>
-          <w:tcPr>
-            <w:tcW w:w="7371" w:type="dxa"/>
-            <w:gridSpan w:val="2"/>
-          </w:tcPr>
-          <w:p>
-            <w:r>
-              <w:t xml:space="preserve">Nombre de la Historia de Usuario: </w:t>
-            </w:r>
-            <w:r>
-              <w:t>Inicio</w:t>
-            </w:r>
-          </w:p>
-          <w:p/>
-        </w:tc>
-      </w:tr>
-      <w:tr>
-        <w:tc>
-          <w:tcPr>
-            <w:tcW w:w="279" w:type="dxa"/>
-          </w:tcPr>
-          <w:p/>
-        </w:tc>
-        <w:tc>
-          <w:tcPr>
-            <w:tcW w:w="9639" w:type="dxa"/>
-            <w:gridSpan w:val="3"/>
-          </w:tcPr>
-          <w:p>
-            <w:r>
-              <w:t>Modificación o Extensión de Historia de Usuario y Número: Ninguna</w:t>
-            </w:r>
-          </w:p>
-        </w:tc>
-      </w:tr>
-      <w:tr>
-        <w:tc>
-          <w:tcPr>
-            <w:tcW w:w="4364" w:type="dxa"/>
-            <w:gridSpan w:val="3"/>
-          </w:tcPr>
-          <w:p>
-            <w:pPr>
-              <w:rPr>
-                <w:b/>
-              </w:rPr>
-            </w:pPr>
-            <w:r>
-              <w:t xml:space="preserve">Usuario: </w:t>
-            </w:r>
-            <w:r>
-              <w:t>Administrador y Clientes</w:t>
-            </w:r>
-          </w:p>
-          <w:p/>
-        </w:tc>
-        <w:tc>
-          <w:tcPr>
-            <w:tcW w:w="5554" w:type="dxa"/>
-          </w:tcPr>
-          <w:p>
-            <w:r>
-              <w:t xml:space="preserve">Iteración asignada: </w:t>
-            </w:r>
-          </w:p>
-          <w:p/>
-        </w:tc>
-      </w:tr>
-      <w:tr>
-        <w:tc>
-          <w:tcPr>
-            <w:tcW w:w="4364" w:type="dxa"/>
-            <w:gridSpan w:val="3"/>
-          </w:tcPr>
-          <w:p>
-            <w:r>
-              <w:t>Prioridad del Negocio: (Alta/Media/ Baja)</w:t>
-            </w:r>
-          </w:p>
-          <w:p>
-            <w:pPr>
-              <w:rPr>
-                <w:b/>
-              </w:rPr>
-            </w:pPr>
-            <w:r>
-              <w:t>Media</w:t>
-            </w:r>
-          </w:p>
-        </w:tc>
-        <w:tc>
-          <w:tcPr>
-            <w:tcW w:w="5554" w:type="dxa"/>
-          </w:tcPr>
-          <w:p>
-            <w:r>
-              <w:t>Puntos Estimados: 1 semana</w:t>
-            </w:r>
-          </w:p>
-          <w:p/>
-        </w:tc>
-      </w:tr>
-      <w:tr>
-        <w:tc>
-          <w:tcPr>
-            <w:tcW w:w="4364" w:type="dxa"/>
-            <w:gridSpan w:val="3"/>
-          </w:tcPr>
-          <w:p>
-            <w:r>
-              <w:t>Riesgo en Desarrollo:  (Alta/Media/ Baja)</w:t>
-            </w:r>
-          </w:p>
-          <w:p>
-            <w:pPr>
-              <w:rPr>
-                <w:b/>
-              </w:rPr>
-            </w:pPr>
-            <w:r>
-              <w:t>Baja</w:t>
-            </w:r>
-          </w:p>
-        </w:tc>
-        <w:tc>
-          <w:tcPr>
-            <w:tcW w:w="5554" w:type="dxa"/>
-          </w:tcPr>
-          <w:p>
-            <w:r>
-              <w:t xml:space="preserve">Puntos Reales: </w:t>
-            </w:r>
-          </w:p>
-          <w:p/>
-        </w:tc>
-      </w:tr>
-      <w:tr>
-        <w:tc>
-          <w:tcPr>
-            <w:tcW w:w="279" w:type="dxa"/>
-          </w:tcPr>
-          <w:p/>
-        </w:tc>
-        <w:tc>
-          <w:tcPr>
-            <w:tcW w:w="9639" w:type="dxa"/>
-            <w:gridSpan w:val="3"/>
-          </w:tcPr>
-          <w:p>
-            <w:r>
-              <w:t>Programador responsable: Dariel Cabrera</w:t>
-            </w:r>
-          </w:p>
-        </w:tc>
-      </w:tr>
-      <w:tr>
-        <w:tc>
-          <w:tcPr>
-            <w:tcW w:w="279" w:type="dxa"/>
-          </w:tcPr>
-          <w:p/>
-        </w:tc>
-        <w:tc>
-          <w:tcPr>
-            <w:tcW w:w="9639" w:type="dxa"/>
-            <w:gridSpan w:val="3"/>
-          </w:tcPr>
-          <w:p>
-            <w:r>
-              <w:rPr>
-                <w:b/>
-              </w:rPr>
-              <w:t xml:space="preserve">Descripción: </w:t>
-            </w:r>
-            <w:r>
-              <w:t>El usuario tendrá visibilidad a las informaciones generales de la página, además de que tendrá</w:t>
-            </w:r>
-            <w:r>
-              <w:rPr>
-                <w:b/>
-              </w:rPr>
-              <w:t xml:space="preserve"> </w:t>
-            </w:r>
-            <w:r>
-              <w:t>las opciones para acceder a las diferentes secciones de la página.</w:t>
-            </w:r>
-          </w:p>
-        </w:tc>
-      </w:tr>
-      <w:tr>
-        <w:tc>
-          <w:tcPr>
-            <w:tcW w:w="279" w:type="dxa"/>
-          </w:tcPr>
-          <w:p/>
-        </w:tc>
-        <w:tc>
-          <w:tcPr>
-            <w:tcW w:w="9639" w:type="dxa"/>
-            <w:gridSpan w:val="3"/>
-          </w:tcPr>
-          <w:p>
-            <w:r>
-              <w:t xml:space="preserve">Observaciones: </w:t>
-            </w:r>
-          </w:p>
-        </w:tc>
-      </w:tr>
-      <w:tr>
-        <w:tc>
-          <w:tcPr>
-            <w:tcW w:w="279" w:type="dxa"/>
-          </w:tcPr>
-          <w:p/>
-        </w:tc>
-        <w:tc>
-          <w:tcPr>
-            <w:tcW w:w="9639" w:type="dxa"/>
-            <w:gridSpan w:val="3"/>
-          </w:tcPr>
-          <w:p>
-            <w:r>
-              <w:t xml:space="preserve">                        </w:t>
-            </w:r>
-            <w:r>
-              <w:rPr>
-                <w:color w:val="auto"/>
-                <w:lang w:eastAsia="en-US"/>
-              </w:rPr>
-              <w:object w:dxaOrig="9315" w:dyaOrig="11385" w14:anchorId="48ABB75A">
-                <v:shapetype id="_x0000_t75" coordsize="21600,21600" o:spt="75" o:preferrelative="t" path="m@4@5l@4@11@9@11@9@5xe" filled="f" stroked="f">
-                  <v:stroke joinstyle="miter"/>
-                  <v:formulas>
-                    <v:f eqn="if lineDrawn pixelLineWidth 0"/>
-                    <v:f eqn="sum @0 1 0"/>
-                    <v:f eqn="sum 0 0 @1"/>
-                    <v:f eqn="prod @2 1 2"/>
-                    <v:f eqn="prod @3 21600 pixelWidth"/>
-                    <v:f eqn="prod @3 21600 pixelHeight"/>
-                    <v:f eqn="sum @0 0 1"/>
-                    <v:f eqn="prod @6 1 2"/>
-                    <v:f eqn="prod @7 21600 pixelWidth"/>
-                    <v:f eqn="sum @8 21600 0"/>
-                    <v:f eqn="prod @7 21600 pixelHeight"/>
-                    <v:f eqn="sum @10 21600 0"/>
-                  </v:formulas>
-                  <v:path o:extrusionok="f" gradientshapeok="t" o:connecttype="rect"/>
-                  <o:lock v:ext="edit" aspectratio="t"/>
-                </v:shapetype>
-                <v:shape id="_x0000_i1025" type="#_x0000_t75" style="width:283.8pt;height:257pt" o:ole="">
-                  <v:imagedata r:id="rId34" o:title=""/>
-                </v:shape>
-                <o:OLEObject Type="Embed" ProgID="PBrush" ShapeID="_x0000_i1025" DrawAspect="Content" ObjectID="_1804570523" r:id="rId35"/>
-              </w:object>
-            </w:r>
-          </w:p>
-        </w:tc>
-      </w:tr>
-    </w:tbl>
-    <w:p/>
-    <w:p/>
-    <w:p/>
-    <w:p/>
-    <w:p/>
-    <w:p/>
-    <w:p/>
-    <w:p/>
-    <w:p/>
-    <w:tbl>
-      <w:tblPr>
-        <w:tblStyle w:val="Tablaconcuadrcula"/>
-        <w:tblW w:w="9918" w:type="dxa"/>
-        <w:tblLook w:val="04A0" w:firstRow="1" w:lastRow="0" w:firstColumn="1" w:lastColumn="0" w:noHBand="0" w:noVBand="1"/>
-      </w:tblPr>
-      <w:tblGrid>
-        <w:gridCol w:w="279"/>
-        <w:gridCol w:w="2268"/>
-        <w:gridCol w:w="1817"/>
-        <w:gridCol w:w="5554"/>
-      </w:tblGrid>
-      <w:tr>
-        <w:tc>
-          <w:tcPr>
-            <w:tcW w:w="279" w:type="dxa"/>
-          </w:tcPr>
-          <w:p/>
-        </w:tc>
-        <w:tc>
-          <w:tcPr>
-            <w:tcW w:w="9639" w:type="dxa"/>
-            <w:gridSpan w:val="3"/>
-          </w:tcPr>
-          <w:p>
-            <w:r>
-              <w:t>Historia de Usuario</w:t>
-            </w:r>
-          </w:p>
-        </w:tc>
-      </w:tr>
-      <w:tr>
-        <w:tc>
-          <w:tcPr>
-            <w:tcW w:w="2547" w:type="dxa"/>
-            <w:gridSpan w:val="2"/>
-          </w:tcPr>
-          <w:p>
-            <w:pPr>
-              <w:rPr>
-                <w:b/>
-              </w:rPr>
-            </w:pPr>
-            <w:r>
-              <w:t xml:space="preserve">Número: </w:t>
-            </w:r>
-            <w:r>
-              <w:t>3</w:t>
-            </w:r>
-          </w:p>
-        </w:tc>
-        <w:tc>
-          <w:tcPr>
-            <w:tcW w:w="7371" w:type="dxa"/>
-            <w:gridSpan w:val="2"/>
-          </w:tcPr>
-          <w:p>
-            <w:r>
-              <w:t xml:space="preserve">Nombre de la Historia de Usuario: </w:t>
-            </w:r>
-            <w:r>
-              <w:t>Cálculo</w:t>
-            </w:r>
-          </w:p>
-          <w:p/>
-        </w:tc>
-      </w:tr>
-      <w:tr>
-        <w:tc>
-          <w:tcPr>
-            <w:tcW w:w="279" w:type="dxa"/>
-          </w:tcPr>
-          <w:p/>
-        </w:tc>
-        <w:tc>
-          <w:tcPr>
-            <w:tcW w:w="9639" w:type="dxa"/>
-            <w:gridSpan w:val="3"/>
-          </w:tcPr>
-          <w:p>
-            <w:r>
-              <w:t>Modificación o Extensión de Historia de Usuario y Número: Ninguna</w:t>
-            </w:r>
-          </w:p>
-        </w:tc>
-      </w:tr>
-      <w:tr>
-        <w:tc>
-          <w:tcPr>
-            <w:tcW w:w="4364" w:type="dxa"/>
-            <w:gridSpan w:val="3"/>
-          </w:tcPr>
-          <w:p>
-            <w:pPr>
-              <w:rPr>
-                <w:b/>
-              </w:rPr>
-            </w:pPr>
-            <w:r>
-              <w:t xml:space="preserve">Usuario: </w:t>
-            </w:r>
-            <w:r>
-              <w:t>Administrador y Clientes</w:t>
-            </w:r>
-          </w:p>
-          <w:p/>
-        </w:tc>
-        <w:tc>
-          <w:tcPr>
-            <w:tcW w:w="5554" w:type="dxa"/>
-          </w:tcPr>
-          <w:p>
-            <w:r>
-              <w:t xml:space="preserve">Iteración asignada: </w:t>
-            </w:r>
-          </w:p>
-          <w:p/>
-        </w:tc>
-      </w:tr>
-      <w:tr>
-        <w:tc>
-          <w:tcPr>
-            <w:tcW w:w="4364" w:type="dxa"/>
-            <w:gridSpan w:val="3"/>
-          </w:tcPr>
-          <w:p>
-            <w:r>
-              <w:t>Prioridad del Negocio: (Alta/Media/ Baja)</w:t>
-            </w:r>
-          </w:p>
-          <w:p>
-            <w:pPr>
-              <w:rPr>
-                <w:b/>
-              </w:rPr>
-            </w:pPr>
-            <w:r>
-              <w:t>Alta</w:t>
-            </w:r>
-          </w:p>
-        </w:tc>
-        <w:tc>
-          <w:tcPr>
-            <w:tcW w:w="5554" w:type="dxa"/>
-          </w:tcPr>
-          <w:p>
-            <w:r>
-              <w:t>Puntos Estimados: 1 semana</w:t>
-            </w:r>
-          </w:p>
-          <w:p/>
-        </w:tc>
-      </w:tr>
-      <w:tr>
-        <w:tc>
-          <w:tcPr>
-            <w:tcW w:w="4364" w:type="dxa"/>
-            <w:gridSpan w:val="3"/>
-          </w:tcPr>
-          <w:p>
-            <w:r>
-              <w:t>Riesgo en Desarrollo: (Alta/Media/ Baja)</w:t>
-            </w:r>
-          </w:p>
-          <w:p>
-            <w:pPr>
-              <w:rPr>
-                <w:b/>
-              </w:rPr>
-            </w:pPr>
-            <w:r>
-              <w:t>Baja</w:t>
-            </w:r>
-          </w:p>
-        </w:tc>
-        <w:tc>
-          <w:tcPr>
-            <w:tcW w:w="5554" w:type="dxa"/>
-          </w:tcPr>
-          <w:p>
-            <w:r>
-              <w:t xml:space="preserve">Puntos Reales: </w:t>
-            </w:r>
-          </w:p>
-          <w:p/>
-        </w:tc>
-      </w:tr>
-      <w:tr>
-        <w:tc>
-          <w:tcPr>
-            <w:tcW w:w="279" w:type="dxa"/>
-          </w:tcPr>
-          <w:p/>
-        </w:tc>
-        <w:tc>
-          <w:tcPr>
-            <w:tcW w:w="9639" w:type="dxa"/>
-            <w:gridSpan w:val="3"/>
-          </w:tcPr>
-          <w:p>
-            <w:r>
-              <w:t>Programador responsable: Dariel Cabrera</w:t>
-            </w:r>
-          </w:p>
-        </w:tc>
-      </w:tr>
-      <w:tr>
-        <w:tc>
-          <w:tcPr>
-            <w:tcW w:w="279" w:type="dxa"/>
-          </w:tcPr>
-          <w:p/>
-        </w:tc>
-        <w:tc>
-          <w:tcPr>
-            <w:tcW w:w="9639" w:type="dxa"/>
-            <w:gridSpan w:val="3"/>
-          </w:tcPr>
-          <w:p>
-            <w:r>
-              <w:rPr>
-                <w:b/>
-              </w:rPr>
-              <w:t>Descripción:</w:t>
-            </w:r>
-            <w:r>
-              <w:rPr>
-                <w:b/>
-              </w:rPr>
-              <w:t xml:space="preserve"> </w:t>
-            </w:r>
-            <w:r>
-              <w:t>El módulo de Cálculo tendrá obligatorios para que el usuario realice la entrada de datos</w:t>
-            </w:r>
-          </w:p>
-        </w:tc>
-      </w:tr>
-      <w:tr>
-        <w:tc>
-          <w:tcPr>
-            <w:tcW w:w="279" w:type="dxa"/>
-          </w:tcPr>
-          <w:p/>
-        </w:tc>
-        <w:tc>
-          <w:tcPr>
-            <w:tcW w:w="9639" w:type="dxa"/>
-            <w:gridSpan w:val="3"/>
-          </w:tcPr>
-          <w:p>
-            <w:r>
-              <w:t xml:space="preserve">Observaciones: </w:t>
-            </w:r>
-          </w:p>
-          <w:p>
-            <w:r>
-              <w:t>En caso que los datos de entradas no estén correctos</w:t>
-            </w:r>
-            <w:r>
-              <w:t xml:space="preserve"> o no entre unos de los datos solicitados</w:t>
-            </w:r>
-            <w:r>
-              <w:t>, se lanza un mensaje alertando que las credenciales son incorrectas.</w:t>
-            </w:r>
-          </w:p>
-        </w:tc>
-      </w:tr>
-      <w:tr>
-        <w:tc>
-          <w:tcPr>
-            <w:tcW w:w="279" w:type="dxa"/>
-          </w:tcPr>
-          <w:p/>
-        </w:tc>
-        <w:tc>
-          <w:tcPr>
-            <w:tcW w:w="9639" w:type="dxa"/>
-            <w:gridSpan w:val="3"/>
-          </w:tcPr>
-          <w:p>
-            <w:r>
-              <w:rPr>
-                <w:noProof/>
-              </w:rPr>
-              <w:t xml:space="preserve">                       </w:t>
-            </w:r>
-            <w:r>
-              <w:rPr>
-                <w:noProof/>
-              </w:rPr>
-              <w:drawing>
-                <wp:inline distT="0" distB="0" distL="0" distR="0" wp14:anchorId="57EE0896" wp14:editId="61CC4552">
-                  <wp:extent cx="3356983" cy="2809875"/>
-                  <wp:effectExtent l="0" t="0" r="0" b="0"/>
-                  <wp:docPr id="6" name="Imagen 6"/>
-                  <wp:cNvGraphicFramePr>
-                    <a:graphicFrameLocks xmlns:a="http://schemas.openxmlformats.org/drawingml/2006/main" noChangeAspect="1"/>
-                  </wp:cNvGraphicFramePr>
-                  <a:graphic xmlns:a="http://schemas.openxmlformats.org/drawingml/2006/main">
-                    <a:graphicData uri="http://schemas.openxmlformats.org/drawingml/2006/picture">
-                      <pic:pic xmlns:pic="http://schemas.openxmlformats.org/drawingml/2006/picture">
-                        <pic:nvPicPr>
-                          <pic:cNvPr id="0" name="Picture 17"/>
-                          <pic:cNvPicPr>
-                            <a:picLocks noChangeAspect="1" noChangeArrowheads="1"/>
-                          </pic:cNvPicPr>
-                        </pic:nvPicPr>
-                        <pic:blipFill>
-                          <a:blip r:embed="rId36">
-                            <a:extLst>
-                              <a:ext uri="{28A0092B-C50C-407E-A947-70E740481C1C}">
-                                <a14:useLocalDpi xmlns:a14="http://schemas.microsoft.com/office/drawing/2010/main" val="0"/>
-                              </a:ext>
-                            </a:extLst>
-                          </a:blip>
-                          <a:srcRect/>
-                          <a:stretch>
-                            <a:fillRect/>
-                          </a:stretch>
-                        </pic:blipFill>
-                        <pic:spPr bwMode="auto">
-                          <a:xfrm>
-                            <a:off x="0" y="0"/>
-                            <a:ext cx="3372613" cy="2822957"/>
-                          </a:xfrm>
-                          <a:prstGeom prst="rect">
-                            <a:avLst/>
-                          </a:prstGeom>
-                          <a:noFill/>
-                          <a:ln>
-                            <a:noFill/>
-                          </a:ln>
-                        </pic:spPr>
-                      </pic:pic>
-                    </a:graphicData>
-                  </a:graphic>
-                </wp:inline>
-              </w:drawing>
-            </w:r>
-          </w:p>
-        </w:tc>
-      </w:tr>
-    </w:tbl>
     <w:p/>
     <w:p>
       <w:pPr>
@@ -12395,7 +12509,7 @@
                     </pic:cNvPicPr>
                   </pic:nvPicPr>
                   <pic:blipFill>
-                    <a:blip r:embed="rId37">
+                    <a:blip r:embed="rId36">
                       <a:extLst>
                         <a:ext uri="{28A0092B-C50C-407E-A947-70E740481C1C}">
                           <a14:useLocalDpi xmlns:a14="http://schemas.microsoft.com/office/drawing/2010/main" val="0"/>
@@ -12438,7 +12552,11 @@
         <w:t xml:space="preserve">   </w:t>
       </w:r>
       <w:r>
-        <w:t>La clase usuario va a realizar muchos cálculos longitudinales, los cuales heredan de la clase Cálculos, estos cálculos ser realizan en una ubicación, en una ubicación se realiza muchos cálculos, en un Municipio hay muchas ubicaciones</w:t>
+        <w:t xml:space="preserve">La clase usuario va a realizar muchos cálculos longitudinales, los cuales heredan de la clase Cálculos, estos cálculos ser realizan en una ubicación, </w:t>
+      </w:r>
+      <w:r>
+        <w:lastRenderedPageBreak/>
+        <w:t>en una ubicación se realiza muchos cálculos, en un Municipio hay muchas ubicaciones</w:t>
       </w:r>
       <w:r>
         <w:t xml:space="preserve"> </w:t>
@@ -12464,7 +12582,6 @@
         <w:rPr>
           <w:noProof/>
         </w:rPr>
-        <w:lastRenderedPageBreak/>
         <w:drawing>
           <wp:inline distT="0" distB="0" distL="0" distR="0" wp14:anchorId="4E801287" wp14:editId="60167983">
             <wp:extent cx="5603240" cy="3561715"/>
@@ -12483,7 +12600,7 @@
                     </pic:cNvPicPr>
                   </pic:nvPicPr>
                   <pic:blipFill>
-                    <a:blip r:embed="rId38">
+                    <a:blip r:embed="rId37">
                       <a:extLst>
                         <a:ext uri="{28A0092B-C50C-407E-A947-70E740481C1C}">
                           <a14:useLocalDpi xmlns:a14="http://schemas.microsoft.com/office/drawing/2010/main" val="0"/>
@@ -12957,12 +13074,21 @@
                 <w:szCs w:val="20"/>
               </w:rPr>
             </w:pPr>
+            <w:proofErr w:type="gramStart"/>
             <w:r>
               <w:rPr>
                 <w:sz w:val="20"/>
                 <w:szCs w:val="20"/>
               </w:rPr>
-              <w:t>Se  registra y entra al sistema</w:t>
+              <w:t>Se  registra</w:t>
+            </w:r>
+            <w:proofErr w:type="gramEnd"/>
+            <w:r>
+              <w:rPr>
+                <w:sz w:val="20"/>
+                <w:szCs w:val="20"/>
+              </w:rPr>
+              <w:t xml:space="preserve"> y entra al sistema</w:t>
             </w:r>
           </w:p>
         </w:tc>
@@ -13087,7 +13213,15 @@
         <w:t xml:space="preserve"> las diversas formas y resultados esperados. En el primero, al entrar datos válidos el sistema permite su entrada y procede al caso dos que se calcula a partir de que el usuario presiona el botón calcular y se guardan los datos entrados en la base de datos, posterior a esto los datos serán mostrados en una tabla. En el caso tres </w:t>
       </w:r>
       <w:r>
-        <w:t xml:space="preserve">si el usuario entra un dato erróneo, ya sea letras en vez de números o cualquier datos que no es el correspondiente a esa entrada , el sistema debe notificarle la mismo que el dato es incorrecto. </w:t>
+        <w:t xml:space="preserve">si el usuario entra un dato erróneo, ya sea letras en vez de números o cualquier datos que no es el correspondiente a esa </w:t>
+      </w:r>
+      <w:proofErr w:type="gramStart"/>
+      <w:r>
+        <w:t>entrada ,</w:t>
+      </w:r>
+      <w:proofErr w:type="gramEnd"/>
+      <w:r>
+        <w:t xml:space="preserve"> el sistema debe notificarle la mismo que el dato es incorrecto. </w:t>
       </w:r>
     </w:p>
     <w:p>
@@ -13537,14 +13671,30 @@
                 <w:sz w:val="20"/>
                 <w:szCs w:val="20"/>
               </w:rPr>
-              <w:t xml:space="preserve">dato que </w:t>
-            </w:r>
+              <w:t xml:space="preserve">dato </w:t>
+            </w:r>
+            <w:proofErr w:type="gramStart"/>
             <w:r>
               <w:rPr>
                 <w:sz w:val="20"/>
                 <w:szCs w:val="20"/>
               </w:rPr>
-              <w:t xml:space="preserve"> es incorrect</w:t>
+              <w:t xml:space="preserve">que </w:t>
+            </w:r>
+            <w:r>
+              <w:rPr>
+                <w:sz w:val="20"/>
+                <w:szCs w:val="20"/>
+              </w:rPr>
+              <w:t xml:space="preserve"> es</w:t>
+            </w:r>
+            <w:proofErr w:type="gramEnd"/>
+            <w:r>
+              <w:rPr>
+                <w:sz w:val="20"/>
+                <w:szCs w:val="20"/>
+              </w:rPr>
+              <w:t xml:space="preserve"> incorrect</w:t>
             </w:r>
             <w:r>
               <w:rPr>
@@ -22096,7 +22246,15 @@
         <w:annotationRef/>
       </w:r>
       <w:r>
-        <w:t xml:space="preserve">Se cambio Usuario por Trabajador.. Usuarios son todos </w:t>
+        <w:t xml:space="preserve">Se cambio Usuario por </w:t>
+      </w:r>
+      <w:proofErr w:type="gramStart"/>
+      <w:r>
+        <w:t>Trabajador..</w:t>
+      </w:r>
+      <w:proofErr w:type="gramEnd"/>
+      <w:r>
+        <w:t xml:space="preserve"> Usuarios son todos </w:t>
       </w:r>
     </w:p>
   </w:comment>

</xml_diff>